<commit_message>
Actualizar planificacion microcurricular 7mo y matriz curricular oficial conforme a Desagregacion y PCA 2026-2027
</commit_message>
<xml_diff>
--- a/PLANIFICACION_MICROCURRICULAR_7MO_LENGUA_1ER_TRIMESTRE final.docx
+++ b/PLANIFICACION_MICROCURRICULAR_7MO_LENGUA_1ER_TRIMESTRE final.docx
@@ -73,7 +73,7 @@
               <mc:AlternateContent>
                 <mc:Choice Requires="wps">
                   <w:drawing>
-                    <wp:anchor distT="0" distB="0" distL="114300" distR="114300" simplePos="0" relativeHeight="251659264" behindDoc="0" locked="0" layoutInCell="1" allowOverlap="1" wp14:anchorId="2B5181AE" wp14:editId="70E8CAB9">
+                    <wp:anchor distT="0" distB="0" distL="114300" distR="114300" simplePos="0" relativeHeight="251659264" behindDoc="0" locked="0" layoutInCell="1" allowOverlap="1" wp14:anchorId="18D3898F" wp14:editId="0650F7AA">
                       <wp:simplePos x="0" y="0"/>
                       <wp:positionH relativeFrom="column">
                         <wp:posOffset>44450</wp:posOffset>
@@ -121,7 +121,7 @@
                                       <w:lang w:val="en-US" w:eastAsia="en-US"/>
                                     </w:rPr>
                                     <w:drawing>
-                                      <wp:inline distT="0" distB="0" distL="0" distR="0" wp14:anchorId="298983B2" wp14:editId="1B8E1531">
+                                      <wp:inline distT="0" distB="0" distL="0" distR="0" wp14:anchorId="407815EB" wp14:editId="59ED9CB4">
                                         <wp:extent cx="898643" cy="736691"/>
                                         <wp:effectExtent l="0" t="0" r="0" b="6350"/>
                                         <wp:docPr id="59" name="Imagen 59"/>
@@ -394,7 +394,6 @@
             <w:shd w:val="clear" w:color="auto" w:fill="auto"/>
           </w:tcPr>
           <w:p>
-            <w:r/>
             <w:r>
               <w:rPr>
                 <w:rFonts w:ascii="Times New Roman" w:hAnsi="Times New Roman"/>
@@ -892,47 +891,83 @@
               <w:left w:val="single" w:sz="4" w:space="0" w:color="auto"/>
             </w:tcBorders>
             <w:shd w:val="clear" w:color="auto" w:fill="auto"/>
-            <w:vAlign w:val="bottom"/>
           </w:tcPr>
           <w:p>
             <w:pPr>
-              <w:rPr>
-                <w:rFonts w:ascii="Times New Roman" w:hAnsi="Times New Roman" w:cs="Times New Roman"/>
-              </w:rPr>
-            </w:pPr>
-            <w:r>
-              <w:rPr>
-                <w:rFonts w:ascii="Times New Roman" w:hAnsi="Times New Roman" w:cs="Times New Roman"/>
+              <w:spacing w:after="60" w:before="20"/>
+            </w:pPr>
+            <w:r/>
+            <w:r>
+              <w:rPr>
+                <w:rFonts w:ascii="Times New Roman" w:hAnsi="Times New Roman"/>
               </w:rPr>
               <w:t>O.LL.3.1. Interactuar con diversas expresiones culturales para acceder, participar y apropiarse de la cultura escrita.</w:t>
             </w:r>
-            <w:r>
-              <w:rPr>
-                <w:rFonts w:ascii="Times New Roman" w:hAnsi="Times New Roman" w:cs="Times New Roman"/>
-              </w:rPr>
-              <w:br/>
+          </w:p>
+          <w:p>
+            <w:pPr>
+              <w:spacing w:after="60" w:before="20"/>
+            </w:pPr>
+            <w:r>
+              <w:rPr>
+                <w:rFonts w:ascii="Times New Roman" w:hAnsi="Times New Roman"/>
+              </w:rPr>
               <w:t>O.LL.3.3. Comprender discursos orales en diversos contextos de la actividad social y cultural y analizarlos con sentido crítico.</w:t>
             </w:r>
-            <w:r>
-              <w:rPr>
-                <w:rFonts w:ascii="Times New Roman" w:hAnsi="Times New Roman" w:cs="Times New Roman"/>
-              </w:rPr>
-              <w:br/>
-              <w:t>O.LL.3.6. Leer de manera autónoma textos no literarios, con fines de recreación, información y aprendizaje, y aplicar estrategias cognitivas de comprensión.</w:t>
-            </w:r>
-            <w:r>
-              <w:rPr>
-                <w:rFonts w:ascii="Times New Roman" w:hAnsi="Times New Roman" w:cs="Times New Roman"/>
-              </w:rPr>
-              <w:br/>
-              <w:t>O.LL.3.8. Escribir relatos y textos expositivos, descriptivos e instructivos, adecuados a una situación comunicativa determinada para aprender y comunicarse.</w:t>
-            </w:r>
-            <w:r>
-              <w:rPr>
-                <w:rFonts w:ascii="Times New Roman" w:hAnsi="Times New Roman" w:cs="Times New Roman"/>
-              </w:rPr>
-              <w:br/>
+          </w:p>
+          <w:p>
+            <w:pPr>
+              <w:spacing w:after="60" w:before="20"/>
+            </w:pPr>
+            <w:r>
+              <w:rPr>
+                <w:rFonts w:ascii="Times New Roman" w:hAnsi="Times New Roman"/>
+              </w:rPr>
+              <w:t>O.LL.3.6. Leer de manera autónoma textos no literarios, con fines de recreación, información y aprendizaje, y utilizar estrategias cognitivas de comprensión de acuerdo al tipo de texto.</w:t>
+            </w:r>
+          </w:p>
+          <w:p>
+            <w:pPr>
+              <w:spacing w:after="60" w:before="20"/>
+            </w:pPr>
+            <w:r>
+              <w:rPr>
+                <w:rFonts w:ascii="Times New Roman" w:hAnsi="Times New Roman"/>
+              </w:rPr>
+              <w:t>O.LL.3.8. Escribir relatos y textos expositivos, descriptivos e instructivos, adecuados a una situación comunicativa determinada para aprender, comunicarse y desarrollar el pensamiento.</w:t>
+            </w:r>
+          </w:p>
+          <w:p>
+            <w:pPr>
+              <w:spacing w:after="60" w:before="20"/>
+            </w:pPr>
+            <w:r>
+              <w:rPr>
+                <w:rFonts w:ascii="Times New Roman" w:hAnsi="Times New Roman"/>
+              </w:rPr>
+              <w:t>O.LL.3.10. Aplicar los conocimientos semánticos, léxicos, sintácticos, ortográficos y las propiedades textuales en los procesos de composición y revisión de textos escritos.</w:t>
+            </w:r>
+          </w:p>
+          <w:p>
+            <w:pPr>
+              <w:spacing w:after="60" w:before="20"/>
+            </w:pPr>
+            <w:r>
+              <w:rPr>
+                <w:rFonts w:ascii="Times New Roman" w:hAnsi="Times New Roman"/>
+              </w:rPr>
               <w:t>O.LL.3.11. Seleccionar y disfrutar textos literarios para realizar interpretaciones personales y construir significados compartidos con otros lectores.</w:t>
+            </w:r>
+          </w:p>
+          <w:p>
+            <w:pPr>
+              <w:spacing w:after="60" w:before="20"/>
+            </w:pPr>
+            <w:r>
+              <w:rPr>
+                <w:rFonts w:ascii="Times New Roman" w:hAnsi="Times New Roman"/>
+              </w:rPr>
+              <w:t>O.LL.3.12. Aplicar los recursos del lenguaje, a partir de los textos literarios, para fortalecer y profundizar la escritura creativa.</w:t>
             </w:r>
           </w:p>
         </w:tc>
@@ -1062,7 +1097,7 @@
                 <w:lang w:val="en-US" w:eastAsia="en-US"/>
               </w:rPr>
               <w:drawing>
-                <wp:inline distT="0" distB="0" distL="0" distR="0" wp14:anchorId="2DB6053B" wp14:editId="3AF3832C">
+                <wp:inline distT="0" distB="0" distL="0" distR="0" wp14:anchorId="6B39D786" wp14:editId="250E144F">
                   <wp:extent cx="561975" cy="352425"/>
                   <wp:effectExtent l="0" t="0" r="9525" b="9525"/>
                   <wp:docPr id="1" name="Imagen 1"/>
@@ -1161,7 +1196,7 @@
                 <w:lang w:val="en-US" w:eastAsia="en-US"/>
               </w:rPr>
               <w:drawing>
-                <wp:inline distT="0" distB="0" distL="0" distR="0" wp14:anchorId="2AFC078D" wp14:editId="21BA7A86">
+                <wp:inline distT="0" distB="0" distL="0" distR="0" wp14:anchorId="282DF271" wp14:editId="05BAA76E">
                   <wp:extent cx="514350" cy="342900"/>
                   <wp:effectExtent l="0" t="0" r="0" b="0"/>
                   <wp:docPr id="4" name="Imagen 4"/>
@@ -1259,7 +1294,7 @@
                 <w:lang w:val="en-US" w:eastAsia="en-US"/>
               </w:rPr>
               <w:drawing>
-                <wp:inline distT="0" distB="0" distL="0" distR="0" wp14:anchorId="09FB3967" wp14:editId="05D5EC47">
+                <wp:inline distT="0" distB="0" distL="0" distR="0" wp14:anchorId="64B5DA49" wp14:editId="2F840C9F">
                   <wp:extent cx="478290" cy="352425"/>
                   <wp:effectExtent l="0" t="0" r="0" b="0"/>
                   <wp:docPr id="5" name="Imagen 5"/>
@@ -1347,7 +1382,7 @@
                 <w:lang w:val="en-US" w:eastAsia="en-US"/>
               </w:rPr>
               <w:drawing>
-                <wp:inline distT="0" distB="0" distL="0" distR="0" wp14:anchorId="7AD61AAF" wp14:editId="02CAA2F0">
+                <wp:inline distT="0" distB="0" distL="0" distR="0" wp14:anchorId="77E4EB07" wp14:editId="24195F62">
                   <wp:extent cx="641916" cy="352425"/>
                   <wp:effectExtent l="0" t="0" r="6350" b="0"/>
                   <wp:docPr id="7" name="Imagen 7"/>
@@ -1431,6 +1466,7 @@
                 <w:rFonts w:ascii="Times New Roman" w:hAnsi="Times New Roman" w:cs="Times New Roman"/>
                 <w:b/>
               </w:rPr>
+              <w:lastRenderedPageBreak/>
               <w:t xml:space="preserve">DESTREZAS CON CRITERIOS DE DESEMPEÑO  </w:t>
             </w:r>
           </w:p>
@@ -1557,95 +1593,25 @@
           </w:tcPr>
           <w:p>
             <w:pPr>
-              <w:rPr>
-                <w:rFonts w:ascii="Times New Roman" w:hAnsi="Times New Roman" w:cs="Times New Roman"/>
-              </w:rPr>
-            </w:pPr>
-            <w:r>
-              <w:rPr>
-                <w:rFonts w:ascii="Times New Roman" w:hAnsi="Times New Roman" w:cs="Times New Roman"/>
-              </w:rPr>
-              <w:lastRenderedPageBreak/>
+              <w:spacing w:after="60"/>
+            </w:pPr>
+            <w:r/>
+            <w:r>
+              <w:rPr>
+                <w:rFonts w:ascii="Times New Roman" w:hAnsi="Times New Roman"/>
+              </w:rPr>
               <w:t>LL.3.1.1. Participar en contextos y situaciones que evidencien la funcionalidad de la lengua escrita como herramienta cultural.</w:t>
             </w:r>
           </w:p>
           <w:p>
             <w:pPr>
-              <w:shd w:val="clear" w:color="auto" w:fill="FFE599"/>
-              <w:spacing w:before="40" w:after="40"/>
-              <w:rPr>
-                <w:rFonts w:ascii="Times New Roman" w:hAnsi="Times New Roman" w:cs="Times New Roman"/>
-              </w:rPr>
-            </w:pPr>
-            <w:r>
-              <w:rPr>
-                <w:rFonts w:ascii="Times New Roman" w:hAnsi="Times New Roman" w:cs="Times New Roman"/>
+              <w:spacing w:after="40"/>
+            </w:pPr>
+            <w:r>
+              <w:rPr>
+                <w:rFonts w:ascii="Times New Roman" w:hAnsi="Times New Roman"/>
               </w:rPr>
               <w:t>CS.3.2.22. Reconocer y practicar la honestidad, la integridad y el respeto a los acuerdos y normas como valores fundamentales en la vida personal, escolar y comunitaria.</w:t>
-            </w:r>
-            <w:r>
-              <w:rPr>
-                <w:rFonts w:ascii="Times New Roman" w:hAnsi="Times New Roman" w:cs="Times New Roman"/>
-                <w:noProof/>
-                <w:lang w:val="en-US" w:eastAsia="en-US"/>
-              </w:rPr>
-              <w:drawing>
-                <wp:inline distT="0" distB="0" distL="0" distR="0" wp14:anchorId="32D9924D" wp14:editId="5FCE67E5">
-                  <wp:extent cx="365760" cy="229375"/>
-                  <wp:effectExtent l="0" t="0" r="0" b="0"/>
-                  <wp:docPr id="2" name="Imagen 2"/>
-                  <wp:cNvGraphicFramePr>
-                    <a:graphicFrameLocks xmlns:a="http://schemas.openxmlformats.org/drawingml/2006/main" noChangeAspect="1"/>
-                  </wp:cNvGraphicFramePr>
-                  <a:graphic xmlns:a="http://schemas.openxmlformats.org/drawingml/2006/main">
-                    <a:graphicData uri="http://schemas.openxmlformats.org/drawingml/2006/picture">
-                      <pic:pic xmlns:pic="http://schemas.openxmlformats.org/drawingml/2006/picture">
-                        <pic:nvPicPr>
-                          <pic:cNvPr id="0" name=""/>
-                          <pic:cNvPicPr/>
-                        </pic:nvPicPr>
-                        <pic:blipFill rotWithShape="1">
-                          <a:blip r:embed="rId7" cstate="print">
-                            <a:extLst>
-                              <a:ext uri="{BEBA8EAE-BF5A-486C-A8C5-ECC9F3942E4B}">
-                                <a14:imgProps xmlns:a14="http://schemas.microsoft.com/office/drawing/2010/main">
-                                  <a14:imgLayer r:embed="rId8">
-                                    <a14:imgEffect>
-                                      <a14:sharpenSoften amount="25000"/>
-                                    </a14:imgEffect>
-                                  </a14:imgLayer>
-                                </a14:imgProps>
-                              </a:ext>
-                              <a:ext uri="{28A0092B-C50C-407E-A947-70E740481C1C}">
-                                <a14:useLocalDpi xmlns:a14="http://schemas.microsoft.com/office/drawing/2010/main"/>
-                              </a:ext>
-                            </a:extLst>
-                          </a:blip>
-                          <a:srcRect/>
-                          <a:stretch/>
-                        </pic:blipFill>
-                        <pic:spPr bwMode="auto">
-                          <a:xfrm>
-                            <a:off x="0" y="0"/>
-                            <a:ext cx="371305" cy="232852"/>
-                          </a:xfrm>
-                          <a:prstGeom prst="rect">
-                            <a:avLst/>
-                          </a:prstGeom>
-                          <a:ln>
-                            <a:noFill/>
-                          </a:ln>
-                          <a:extLst>
-                            <a:ext uri="{53640926-AAD7-44D8-BBD7-CCE9431645EC}">
-                              <a14:shadowObscured xmlns:a14="http://schemas.microsoft.com/office/drawing/2010/main"/>
-                            </a:ext>
-                          </a:extLst>
-                        </pic:spPr>
-                      </pic:pic>
-                    </a:graphicData>
-                  </a:graphic>
-                </wp:inline>
-              </w:drawing>
             </w:r>
           </w:p>
         </w:tc>
@@ -2854,15 +2820,14 @@
           </w:tcPr>
           <w:p>
             <w:pPr>
-              <w:rPr>
-                <w:rFonts w:ascii="Times New Roman" w:hAnsi="Times New Roman" w:cs="Times New Roman"/>
-              </w:rPr>
-            </w:pPr>
-            <w:r>
-              <w:rPr>
-                <w:rFonts w:ascii="Times New Roman" w:hAnsi="Times New Roman" w:cs="Times New Roman"/>
-              </w:rPr>
-              <w:t>Reconoce la funcionalidad de la lengua escrita como manifestación cultural y de identidad en diferentes contextos y situaciones, atendiendo a la diversidad lingüística del Ecuador. I.LL.3.1.1.</w:t>
+              <w:spacing w:after="60"/>
+            </w:pPr>
+            <w:r/>
+            <w:r>
+              <w:rPr>
+                <w:rFonts w:ascii="Times New Roman" w:hAnsi="Times New Roman"/>
+              </w:rPr>
+              <w:t>I.LL.3.1.1. Reconoce la funcionalidad de la lengua escrita como manifestación cultural y de identidad en diferentes contextos y situaciones, atendiendo a la diversidad lingüística del Ecuador. (I.3., S.2.)</w:t>
             </w:r>
           </w:p>
         </w:tc>
@@ -2897,14 +2862,7 @@
                 <w:rFonts w:ascii="Times New Roman" w:hAnsi="Times New Roman"/>
                 <w:sz w:val="20"/>
               </w:rPr>
-              <w:t xml:space="preserve">Instrumento: </w:t>
-            </w:r>
-            <w:r>
-              <w:rPr>
-                <w:rFonts w:ascii="Times New Roman" w:hAnsi="Times New Roman"/>
-                <w:sz w:val="20"/>
-              </w:rPr>
-              <w:t>evaluación formativa página 17</w:t>
+              <w:t>Instrumento: evaluación formativa página 17</w:t>
             </w:r>
           </w:p>
         </w:tc>
@@ -2921,158 +2879,25 @@
           </w:tcPr>
           <w:p>
             <w:pPr>
-              <w:rPr>
-                <w:rFonts w:ascii="Times New Roman" w:hAnsi="Times New Roman" w:cs="Times New Roman"/>
-              </w:rPr>
-            </w:pPr>
-            <w:r>
-              <w:rPr>
-                <w:rFonts w:ascii="Times New Roman" w:hAnsi="Times New Roman" w:cs="Times New Roman"/>
+              <w:spacing w:after="60"/>
+            </w:pPr>
+            <w:r/>
+            <w:r>
+              <w:rPr>
+                <w:rFonts w:ascii="Times New Roman" w:hAnsi="Times New Roman"/>
               </w:rPr>
               <w:t>LL.3.2.1. Escuchar discursos orales y formular juicios de valor con respecto a su contenido y forma, y participar de manera respetuosa frente a las intervenciones de los demás.</w:t>
             </w:r>
           </w:p>
           <w:p>
             <w:pPr>
-              <w:shd w:val="clear" w:color="auto" w:fill="FCE7F3"/>
-              <w:spacing w:before="40" w:after="40"/>
-              <w:rPr>
-                <w:rFonts w:ascii="Times New Roman" w:hAnsi="Times New Roman" w:cs="Times New Roman"/>
-              </w:rPr>
-            </w:pPr>
-            <w:r>
-              <w:rPr>
-                <w:rFonts w:ascii="Times New Roman" w:hAnsi="Times New Roman" w:cs="Times New Roman"/>
+              <w:spacing w:after="40"/>
+            </w:pPr>
+            <w:r>
+              <w:rPr>
+                <w:rFonts w:ascii="Times New Roman" w:hAnsi="Times New Roman"/>
               </w:rPr>
               <w:t>CS.3.3.9. Destacar y aplicar la empatía, el diálogo reflexivo y la autorregulación emocional en los espacios escolares y familiares para una resolución pacífica de conflictos.</w:t>
-            </w:r>
-            <w:r>
-              <w:rPr>
-                <w:rFonts w:ascii="Times New Roman" w:hAnsi="Times New Roman" w:cs="Times New Roman"/>
-                <w:noProof/>
-                <w:lang w:val="en-US" w:eastAsia="en-US"/>
-              </w:rPr>
-              <w:drawing>
-                <wp:inline distT="0" distB="0" distL="0" distR="0" wp14:anchorId="0C749775" wp14:editId="6FE3201E">
-                  <wp:extent cx="381000" cy="254000"/>
-                  <wp:effectExtent l="0" t="0" r="0" b="0"/>
-                  <wp:docPr id="6" name="Imagen 6"/>
-                  <wp:cNvGraphicFramePr>
-                    <a:graphicFrameLocks xmlns:a="http://schemas.openxmlformats.org/drawingml/2006/main" noChangeAspect="1"/>
-                  </wp:cNvGraphicFramePr>
-                  <a:graphic xmlns:a="http://schemas.openxmlformats.org/drawingml/2006/main">
-                    <a:graphicData uri="http://schemas.openxmlformats.org/drawingml/2006/picture">
-                      <pic:pic xmlns:pic="http://schemas.openxmlformats.org/drawingml/2006/picture">
-                        <pic:nvPicPr>
-                          <pic:cNvPr id="0" name=""/>
-                          <pic:cNvPicPr/>
-                        </pic:nvPicPr>
-                        <pic:blipFill rotWithShape="1">
-                          <a:blip r:embed="rId9" cstate="screen">
-                            <a:extLst>
-                              <a:ext uri="{BEBA8EAE-BF5A-486C-A8C5-ECC9F3942E4B}">
-                                <a14:imgProps xmlns:a14="http://schemas.microsoft.com/office/drawing/2010/main">
-                                  <a14:imgLayer r:embed="rId10">
-                                    <a14:imgEffect>
-                                      <a14:sharpenSoften amount="25000"/>
-                                    </a14:imgEffect>
-                                  </a14:imgLayer>
-                                </a14:imgProps>
-                              </a:ext>
-                              <a:ext uri="{28A0092B-C50C-407E-A947-70E740481C1C}">
-                                <a14:useLocalDpi xmlns:a14="http://schemas.microsoft.com/office/drawing/2010/main"/>
-                              </a:ext>
-                            </a:extLst>
-                          </a:blip>
-                          <a:srcRect/>
-                          <a:stretch/>
-                        </pic:blipFill>
-                        <pic:spPr bwMode="auto">
-                          <a:xfrm>
-                            <a:off x="0" y="0"/>
-                            <a:ext cx="381313" cy="254209"/>
-                          </a:xfrm>
-                          <a:prstGeom prst="rect">
-                            <a:avLst/>
-                          </a:prstGeom>
-                          <a:ln>
-                            <a:noFill/>
-                          </a:ln>
-                          <a:extLst>
-                            <a:ext uri="{53640926-AAD7-44D8-BBD7-CCE9431645EC}">
-                              <a14:shadowObscured xmlns:a14="http://schemas.microsoft.com/office/drawing/2010/main"/>
-                            </a:ext>
-                          </a:extLst>
-                        </pic:spPr>
-                      </pic:pic>
-                    </a:graphicData>
-                  </a:graphic>
-                </wp:inline>
-              </w:drawing>
-            </w:r>
-            <w:r>
-              <w:rPr>
-                <w:rFonts w:ascii="Times New Roman" w:hAnsi="Times New Roman" w:cs="Times New Roman"/>
-                <w:noProof/>
-                <w:lang w:val="en-US" w:eastAsia="en-US"/>
-              </w:rPr>
-              <w:drawing>
-                <wp:inline distT="0" distB="0" distL="0" distR="0" wp14:anchorId="77541D13" wp14:editId="70EC5D9B">
-                  <wp:extent cx="365760" cy="229375"/>
-                  <wp:effectExtent l="0" t="0" r="0" b="0"/>
-                  <wp:docPr id="8" name="Imagen 8"/>
-                  <wp:cNvGraphicFramePr>
-                    <a:graphicFrameLocks xmlns:a="http://schemas.openxmlformats.org/drawingml/2006/main" noChangeAspect="1"/>
-                  </wp:cNvGraphicFramePr>
-                  <a:graphic xmlns:a="http://schemas.openxmlformats.org/drawingml/2006/main">
-                    <a:graphicData uri="http://schemas.openxmlformats.org/drawingml/2006/picture">
-                      <pic:pic xmlns:pic="http://schemas.openxmlformats.org/drawingml/2006/picture">
-                        <pic:nvPicPr>
-                          <pic:cNvPr id="0" name=""/>
-                          <pic:cNvPicPr/>
-                        </pic:nvPicPr>
-                        <pic:blipFill rotWithShape="1">
-                          <a:blip r:embed="rId7" cstate="print">
-                            <a:extLst>
-                              <a:ext uri="{BEBA8EAE-BF5A-486C-A8C5-ECC9F3942E4B}">
-                                <a14:imgProps xmlns:a14="http://schemas.microsoft.com/office/drawing/2010/main">
-                                  <a14:imgLayer r:embed="rId8">
-                                    <a14:imgEffect>
-                                      <a14:sharpenSoften amount="25000"/>
-                                    </a14:imgEffect>
-                                  </a14:imgLayer>
-                                </a14:imgProps>
-                              </a:ext>
-                              <a:ext uri="{28A0092B-C50C-407E-A947-70E740481C1C}">
-                                <a14:useLocalDpi xmlns:a14="http://schemas.microsoft.com/office/drawing/2010/main"/>
-                              </a:ext>
-                            </a:extLst>
-                          </a:blip>
-                          <a:srcRect/>
-                          <a:stretch/>
-                        </pic:blipFill>
-                        <pic:spPr bwMode="auto">
-                          <a:xfrm>
-                            <a:off x="0" y="0"/>
-                            <a:ext cx="371305" cy="232852"/>
-                          </a:xfrm>
-                          <a:prstGeom prst="rect">
-                            <a:avLst/>
-                          </a:prstGeom>
-                          <a:ln>
-                            <a:noFill/>
-                          </a:ln>
-                          <a:extLst>
-                            <a:ext uri="{53640926-AAD7-44D8-BBD7-CCE9431645EC}">
-                              <a14:shadowObscured xmlns:a14="http://schemas.microsoft.com/office/drawing/2010/main"/>
-                            </a:ext>
-                          </a:extLst>
-                        </pic:spPr>
-                      </pic:pic>
-                    </a:graphicData>
-                  </a:graphic>
-                </wp:inline>
-              </w:drawing>
             </w:r>
           </w:p>
         </w:tc>
@@ -3283,31 +3108,7 @@
               <w:rPr>
                 <w:rFonts w:ascii="Times New Roman" w:hAnsi="Times New Roman" w:cs="Times New Roman"/>
               </w:rPr>
-              <w:t xml:space="preserve">En casa, el estudiante observa y lee la escena inicial de las páginas 18 y 19. A través del enlace digital sugerido, observa y escucha </w:t>
-            </w:r>
-            <w:r>
-              <w:rPr>
-                <w:rFonts w:ascii="Times New Roman" w:hAnsi="Times New Roman" w:cs="Times New Roman"/>
-              </w:rPr>
-              <w:t>el discurso</w:t>
-            </w:r>
-            <w:r>
-              <w:rPr>
-                <w:rFonts w:ascii="Times New Roman" w:hAnsi="Times New Roman" w:cs="Times New Roman"/>
-              </w:rPr>
-              <w:t xml:space="preserve"> de Severn Suzuki («La niña que silenció al mundo»)</w:t>
-            </w:r>
-            <w:r>
-              <w:rPr>
-                <w:rFonts w:ascii="Times New Roman" w:hAnsi="Times New Roman" w:cs="Times New Roman"/>
-              </w:rPr>
-              <w:t xml:space="preserve"> https://www.youtube.com/watch?v=ON36asE9S6Q</w:t>
-            </w:r>
-            <w:r>
-              <w:rPr>
-                <w:rFonts w:ascii="Times New Roman" w:hAnsi="Times New Roman" w:cs="Times New Roman"/>
-              </w:rPr>
-              <w:t>, respondiendo 2 preguntas guía en su cuaderno: ¿Qué emoción y mensaje transmitió la oradora a su corta edad? ¿Cómo utilizó su voz, mirada y seguridad para defender el futuro de los niños del planeta?</w:t>
+              <w:t>En casa, el estudiante observa y lee la escena inicial de las páginas 18 y 19. A través del enlace digital sugerido, observa y escucha el discurso de Severn Suzuki («La niña que silenció al mundo») https://www.youtube.com/watch?v=ON36asE9S6Q, respondiendo 2 preguntas guía en su cuaderno: ¿Qué emoción y mensaje transmitió la oradora a su corta edad? ¿Cómo utilizó su voz, mirada y seguridad para defender el futuro de los niños del planeta?</w:t>
             </w:r>
           </w:p>
           <w:p>
@@ -4614,15 +4415,14 @@
           </w:tcPr>
           <w:p>
             <w:pPr>
-              <w:rPr>
-                <w:rFonts w:ascii="Times New Roman" w:hAnsi="Times New Roman" w:cs="Times New Roman"/>
-              </w:rPr>
-            </w:pPr>
-            <w:r>
-              <w:rPr>
-                <w:rFonts w:ascii="Times New Roman" w:hAnsi="Times New Roman" w:cs="Times New Roman"/>
-              </w:rPr>
-              <w:t>Escucha discursos orales, parafrasea su contenido, formula juicios de valor sobre su forma y participa de manera respetuosa frente a las intervenciones de los demás. I.LL.3.2.1.</w:t>
+              <w:spacing w:after="60"/>
+            </w:pPr>
+            <w:r/>
+            <w:r>
+              <w:rPr>
+                <w:rFonts w:ascii="Times New Roman" w:hAnsi="Times New Roman"/>
+              </w:rPr>
+              <w:t>I.LL.3.2.1. Escucha discursos orales (conversaciones, diálogos, narraciones, discusiones, entrevistas, exposiciones, presentaciones), parafrasea su contenido y participa de manera respetuosa frente a las intervenciones de los demás, buscando acuerdos en el debate de temas conflictivos. (J.3., S.1.)</w:t>
             </w:r>
           </w:p>
         </w:tc>
@@ -4657,15 +4457,17 @@
                 <w:rFonts w:ascii="Times New Roman" w:hAnsi="Times New Roman"/>
                 <w:sz w:val="20"/>
               </w:rPr>
-              <w:t xml:space="preserve">Instrumento: evaluación formativa página 24 y </w:t>
-            </w:r>
+              <w:t xml:space="preserve">Instrumento: evaluación formativa página 24 </w:t>
+            </w:r>
+            <w:proofErr w:type="gramStart"/>
             <w:r>
               <w:rPr>
                 <w:rFonts w:ascii="Times New Roman" w:hAnsi="Times New Roman"/>
                 <w:sz w:val="20"/>
               </w:rPr>
-              <w:t xml:space="preserve"> 25</w:t>
-            </w:r>
+              <w:t>y  25</w:t>
+            </w:r>
+            <w:proofErr w:type="gramEnd"/>
           </w:p>
         </w:tc>
       </w:tr>
@@ -4681,115 +4483,36 @@
           </w:tcPr>
           <w:p>
             <w:pPr>
-              <w:rPr>
-                <w:rFonts w:ascii="Times New Roman" w:hAnsi="Times New Roman" w:cs="Times New Roman"/>
-              </w:rPr>
-            </w:pPr>
-            <w:r>
-              <w:rPr>
-                <w:rFonts w:ascii="Times New Roman" w:hAnsi="Times New Roman" w:cs="Times New Roman"/>
-              </w:rPr>
-              <w:t>LL.3.3.5. Valorar los aspectos de forma y el contenido de un texto científico, a partir de criterios preestablecidos.</w:t>
-            </w:r>
-            <w:r>
-              <w:rPr>
-                <w:rFonts w:ascii="Times New Roman" w:hAnsi="Times New Roman" w:cs="Times New Roman"/>
-              </w:rPr>
-              <w:br/>
-            </w:r>
-            <w:r>
-              <w:rPr>
-                <w:rFonts w:ascii="Times New Roman" w:hAnsi="Times New Roman" w:cs="Times New Roman"/>
-              </w:rPr>
-              <w:br/>
-              <w:t>LL.3.3.8. Leer con fluidez y entonación en diversos contextos y con diferentes propósitos.</w:t>
-            </w:r>
-          </w:p>
-          <w:p>
-            <w:pPr>
-              <w:spacing w:before="40" w:after="40"/>
-              <w:rPr>
-                <w:rFonts w:ascii="Times New Roman" w:hAnsi="Times New Roman" w:cs="Times New Roman"/>
-              </w:rPr>
-            </w:pPr>
-          </w:p>
-          <w:p>
-            <w:pPr>
-              <w:shd w:val="clear" w:color="auto" w:fill="FFE599"/>
-              <w:spacing w:before="40" w:after="40"/>
-              <w:rPr>
-                <w:rFonts w:ascii="Times New Roman" w:hAnsi="Times New Roman" w:cs="Times New Roman"/>
-              </w:rPr>
-            </w:pPr>
-            <w:r>
-              <w:rPr>
-                <w:rFonts w:ascii="Times New Roman" w:hAnsi="Times New Roman" w:cs="Times New Roman"/>
+              <w:spacing w:after="60"/>
+            </w:pPr>
+            <w:r/>
+            <w:r>
+              <w:rPr>
+                <w:rFonts w:ascii="Times New Roman" w:hAnsi="Times New Roman"/>
+              </w:rPr>
+              <w:t>LL.3.3.5. Valorar los aspectos de forma y el contenido de un texto, a partir de criterios preestablecidos.</w:t>
+            </w:r>
+          </w:p>
+          <w:p>
+            <w:pPr>
+              <w:spacing w:after="60"/>
+            </w:pPr>
+            <w:r>
+              <w:rPr>
+                <w:rFonts w:ascii="Times New Roman" w:hAnsi="Times New Roman"/>
+              </w:rPr>
+              <w:t>LL.3.3.8. Leer con fluidez y entonación en diversos contextos (familiares, escolares y sociales) y con diferentes propósitos (exponer, informar, narrar, compartir, etc.).</w:t>
+            </w:r>
+          </w:p>
+          <w:p>
+            <w:pPr>
+              <w:spacing w:after="40"/>
+            </w:pPr>
+            <w:r>
+              <w:rPr>
+                <w:rFonts w:ascii="Times New Roman" w:hAnsi="Times New Roman"/>
               </w:rPr>
               <w:t>CS.3.2.19. Establecer las ventajas de la organización comunitaria, la honestidad y el diálogo democrático como mecanismos para resolver problemas y fortalecer la integridad colectiva.</w:t>
-            </w:r>
-            <w:r>
-              <w:rPr>
-                <w:rFonts w:ascii="Times New Roman" w:hAnsi="Times New Roman" w:cs="Times New Roman"/>
-                <w:noProof/>
-                <w:lang w:val="en-US" w:eastAsia="en-US"/>
-              </w:rPr>
-              <w:drawing>
-                <wp:inline distT="0" distB="0" distL="0" distR="0" wp14:anchorId="591D926D" wp14:editId="5E87571B">
-                  <wp:extent cx="365760" cy="229375"/>
-                  <wp:effectExtent l="0" t="0" r="0" b="0"/>
-                  <wp:docPr id="9" name="Imagen 9"/>
-                  <wp:cNvGraphicFramePr>
-                    <a:graphicFrameLocks xmlns:a="http://schemas.openxmlformats.org/drawingml/2006/main" noChangeAspect="1"/>
-                  </wp:cNvGraphicFramePr>
-                  <a:graphic xmlns:a="http://schemas.openxmlformats.org/drawingml/2006/main">
-                    <a:graphicData uri="http://schemas.openxmlformats.org/drawingml/2006/picture">
-                      <pic:pic xmlns:pic="http://schemas.openxmlformats.org/drawingml/2006/picture">
-                        <pic:nvPicPr>
-                          <pic:cNvPr id="0" name=""/>
-                          <pic:cNvPicPr/>
-                        </pic:nvPicPr>
-                        <pic:blipFill rotWithShape="1">
-                          <a:blip r:embed="rId7" cstate="print">
-                            <a:extLst>
-                              <a:ext uri="{BEBA8EAE-BF5A-486C-A8C5-ECC9F3942E4B}">
-                                <a14:imgProps xmlns:a14="http://schemas.microsoft.com/office/drawing/2010/main">
-                                  <a14:imgLayer r:embed="rId8">
-                                    <a14:imgEffect>
-                                      <a14:sharpenSoften amount="25000"/>
-                                    </a14:imgEffect>
-                                  </a14:imgLayer>
-                                </a14:imgProps>
-                              </a:ext>
-                              <a:ext uri="{28A0092B-C50C-407E-A947-70E740481C1C}">
-                                <a14:useLocalDpi xmlns:a14="http://schemas.microsoft.com/office/drawing/2010/main"/>
-                              </a:ext>
-                            </a:extLst>
-                          </a:blip>
-                          <a:srcRect/>
-                          <a:stretch/>
-                        </pic:blipFill>
-                        <pic:spPr bwMode="auto">
-                          <a:xfrm>
-                            <a:off x="0" y="0"/>
-                            <a:ext cx="371305" cy="232852"/>
-                          </a:xfrm>
-                          <a:prstGeom prst="rect">
-                            <a:avLst/>
-                          </a:prstGeom>
-                          <a:ln>
-                            <a:noFill/>
-                          </a:ln>
-                          <a:extLst>
-                            <a:ext uri="{53640926-AAD7-44D8-BBD7-CCE9431645EC}">
-                              <a14:shadowObscured xmlns:a14="http://schemas.microsoft.com/office/drawing/2010/main"/>
-                            </a:ext>
-                          </a:extLst>
-                        </pic:spPr>
-                      </pic:pic>
-                    </a:graphicData>
-                  </a:graphic>
-                </wp:inline>
-              </w:drawing>
             </w:r>
           </w:p>
         </w:tc>
@@ -5997,15 +5720,25 @@
           </w:tcPr>
           <w:p>
             <w:pPr>
-              <w:rPr>
-                <w:rFonts w:ascii="Times New Roman" w:hAnsi="Times New Roman" w:cs="Times New Roman"/>
-              </w:rPr>
-            </w:pPr>
-            <w:r>
-              <w:rPr>
-                <w:rFonts w:ascii="Times New Roman" w:hAnsi="Times New Roman" w:cs="Times New Roman"/>
-              </w:rPr>
-              <w:t>Realiza inferencias fundamentales y proyectivo-valorativas, valora los contenidos y aspectos de forma a partir de criterios preestablecidos, al monitorear su comprensión mediante el uso de estrategias cognitivas. I.LL.3.3.2.</w:t>
+              <w:spacing w:after="60"/>
+            </w:pPr>
+            <w:r/>
+            <w:r>
+              <w:rPr>
+                <w:rFonts w:ascii="Times New Roman" w:hAnsi="Times New Roman"/>
+              </w:rPr>
+              <w:t>Realiza inferencias fundamentales y proyectivo-valorativas, valora los contenidos y aspectos de forma a partir de criterios preestablecidos al monitorear y autorregular su comprensión mediante el uso de estrategias cognitivas. (Ref. I.LL.3.3.2.) (J.2., J.4.)</w:t>
+            </w:r>
+          </w:p>
+          <w:p>
+            <w:pPr>
+              <w:spacing w:after="60"/>
+            </w:pPr>
+            <w:r>
+              <w:rPr>
+                <w:rFonts w:ascii="Times New Roman" w:hAnsi="Times New Roman"/>
+              </w:rPr>
+              <w:t>I.LL.3.4.1. Aplica sus conocimientos lingüísticos (léxicos, semánticos, sintácticos y fonológicos) en la decodificación y comprensión de textos leyendo con fluidez y entonación en diversos contextos (familiares, escolares y sociales) y con diferentes propósitos (exponer, informar, narrar, compartir, etc.). (I.3., I.4.)</w:t>
             </w:r>
           </w:p>
         </w:tc>
@@ -6057,184 +5790,47 @@
           </w:tcPr>
           <w:p>
             <w:pPr>
-              <w:rPr>
-                <w:rFonts w:ascii="Times New Roman" w:hAnsi="Times New Roman" w:cs="Times New Roman"/>
-              </w:rPr>
-            </w:pPr>
-            <w:r>
-              <w:rPr>
-                <w:rFonts w:ascii="Times New Roman" w:hAnsi="Times New Roman" w:cs="Times New Roman"/>
-              </w:rPr>
-              <w:t>LL.3.4.1. Relatar textos con secuencia lógica, manejo de conectores y coherencia en el uso de la persona y el tiempo verbal.</w:t>
-            </w:r>
-            <w:r>
-              <w:rPr>
-                <w:rFonts w:ascii="Times New Roman" w:hAnsi="Times New Roman" w:cs="Times New Roman"/>
-              </w:rPr>
-              <w:br/>
-            </w:r>
-            <w:r>
-              <w:rPr>
-                <w:rFonts w:ascii="Times New Roman" w:hAnsi="Times New Roman" w:cs="Times New Roman"/>
-              </w:rPr>
-              <w:br/>
-              <w:t>LL.3.4.6. Autorregular la producción escrita mediante planificación, redacción y revisión.</w:t>
-            </w:r>
-            <w:r>
-              <w:rPr>
-                <w:rFonts w:ascii="Times New Roman" w:hAnsi="Times New Roman" w:cs="Times New Roman"/>
-              </w:rPr>
-              <w:br/>
-            </w:r>
-            <w:r>
-              <w:rPr>
-                <w:rFonts w:ascii="Times New Roman" w:hAnsi="Times New Roman" w:cs="Times New Roman"/>
-              </w:rPr>
-              <w:br/>
-              <w:t>LL.3.4.10. Integrar en las producciones escritas el verbo (accidentes, modos) y uso del punto y coma (;).</w:t>
-            </w:r>
-          </w:p>
-          <w:p>
-            <w:pPr>
-              <w:shd w:val="clear" w:color="auto" w:fill="DCFCE7"/>
-              <w:spacing w:before="40" w:after="40"/>
-              <w:rPr>
-                <w:rFonts w:ascii="Times New Roman" w:hAnsi="Times New Roman" w:cs="Times New Roman"/>
-              </w:rPr>
-            </w:pPr>
-            <w:r>
-              <w:rPr>
-                <w:rFonts w:ascii="Times New Roman" w:hAnsi="Times New Roman" w:cs="Times New Roman"/>
+              <w:spacing w:after="60"/>
+            </w:pPr>
+            <w:r/>
+            <w:r>
+              <w:rPr>
+                <w:rFonts w:ascii="Times New Roman" w:hAnsi="Times New Roman"/>
+              </w:rPr>
+              <w:t>LL.3.4.1. Relatar textos con secuencia lógica, manejo de conectores y coherencia en el uso de la persona y tiempo verbal, e integrarlos en diversas situaciones comunicativas.</w:t>
+            </w:r>
+          </w:p>
+          <w:p>
+            <w:pPr>
+              <w:spacing w:after="60"/>
+            </w:pPr>
+            <w:r>
+              <w:rPr>
+                <w:rFonts w:ascii="Times New Roman" w:hAnsi="Times New Roman"/>
+              </w:rPr>
+              <w:t>LL.3.4.6. Autorregular la producción escrita mediante el uso habitual del procedimiento de planificación, redacción y revisión del texto.</w:t>
+            </w:r>
+          </w:p>
+          <w:p>
+            <w:pPr>
+              <w:spacing w:after="60"/>
+            </w:pPr>
+            <w:r>
+              <w:rPr>
+                <w:rFonts w:ascii="Times New Roman" w:hAnsi="Times New Roman"/>
+              </w:rPr>
+              <w:t>LL.3.4.10. Expresar sus ideas con precisión e integrar en las producciones escritas los diferentes tipos de sustantivo, pronombre, adjetivo, verbo, adverbio y sus modificadores.</w:t>
+            </w:r>
+          </w:p>
+          <w:p>
+            <w:pPr>
+              <w:spacing w:after="40"/>
+            </w:pPr>
+            <w:r>
+              <w:rPr>
+                <w:rFonts w:ascii="Times New Roman" w:hAnsi="Times New Roman"/>
               </w:rPr>
               <w:t>CS.3.3.15. Examinar y practicar las normas de tránsito, deberes y derechos de peatones, ciclistas y usuarios de transporte para promover una movilidad segura, preventiva y sostenible.</w:t>
-            </w:r>
-            <w:r>
-              <w:rPr>
-                <w:rFonts w:ascii="Times New Roman" w:hAnsi="Times New Roman" w:cs="Times New Roman"/>
-                <w:noProof/>
-                <w:lang w:val="en-US" w:eastAsia="en-US"/>
-              </w:rPr>
-              <w:drawing>
-                <wp:inline distT="0" distB="0" distL="0" distR="0" wp14:anchorId="0B2FE938" wp14:editId="323FFE9A">
-                  <wp:extent cx="365760" cy="269508"/>
-                  <wp:effectExtent l="0" t="0" r="0" b="0"/>
-                  <wp:docPr id="10" name="Imagen 10"/>
-                  <wp:cNvGraphicFramePr>
-                    <a:graphicFrameLocks xmlns:a="http://schemas.openxmlformats.org/drawingml/2006/main" noChangeAspect="1"/>
-                  </wp:cNvGraphicFramePr>
-                  <a:graphic xmlns:a="http://schemas.openxmlformats.org/drawingml/2006/main">
-                    <a:graphicData uri="http://schemas.openxmlformats.org/drawingml/2006/picture">
-                      <pic:pic xmlns:pic="http://schemas.openxmlformats.org/drawingml/2006/picture">
-                        <pic:nvPicPr>
-                          <pic:cNvPr id="0" name=""/>
-                          <pic:cNvPicPr/>
-                        </pic:nvPicPr>
-                        <pic:blipFill rotWithShape="1">
-                          <a:blip r:embed="rId11" cstate="print">
-                            <a:extLst>
-                              <a:ext uri="{BEBA8EAE-BF5A-486C-A8C5-ECC9F3942E4B}">
-                                <a14:imgProps xmlns:a14="http://schemas.microsoft.com/office/drawing/2010/main">
-                                  <a14:imgLayer r:embed="rId12">
-                                    <a14:imgEffect>
-                                      <a14:sharpenSoften amount="25000"/>
-                                    </a14:imgEffect>
-                                  </a14:imgLayer>
-                                </a14:imgProps>
-                              </a:ext>
-                              <a:ext uri="{28A0092B-C50C-407E-A947-70E740481C1C}">
-                                <a14:useLocalDpi xmlns:a14="http://schemas.microsoft.com/office/drawing/2010/main"/>
-                              </a:ext>
-                            </a:extLst>
-                          </a:blip>
-                          <a:srcRect/>
-                          <a:stretch/>
-                        </pic:blipFill>
-                        <pic:spPr bwMode="auto">
-                          <a:xfrm>
-                            <a:off x="0" y="0"/>
-                            <a:ext cx="367978" cy="271143"/>
-                          </a:xfrm>
-                          <a:prstGeom prst="rect">
-                            <a:avLst/>
-                          </a:prstGeom>
-                          <a:ln>
-                            <a:noFill/>
-                          </a:ln>
-                          <a:extLst>
-                            <a:ext uri="{53640926-AAD7-44D8-BBD7-CCE9431645EC}">
-                              <a14:shadowObscured xmlns:a14="http://schemas.microsoft.com/office/drawing/2010/main"/>
-                            </a:ext>
-                          </a:extLst>
-                        </pic:spPr>
-                      </pic:pic>
-                    </a:graphicData>
-                  </a:graphic>
-                </wp:inline>
-              </w:drawing>
-            </w:r>
-            <w:r>
-              <w:rPr>
-                <w:rFonts w:ascii="Times New Roman" w:hAnsi="Times New Roman" w:cs="Times New Roman"/>
-                <w:noProof/>
-                <w:lang w:val="en-US" w:eastAsia="en-US"/>
-              </w:rPr>
-              <w:drawing>
-                <wp:inline distT="0" distB="0" distL="0" distR="0" wp14:anchorId="5A273344" wp14:editId="2CE695BD">
-                  <wp:extent cx="365760" cy="229375"/>
-                  <wp:effectExtent l="0" t="0" r="0" b="0"/>
-                  <wp:docPr id="11" name="Imagen 11"/>
-                  <wp:cNvGraphicFramePr>
-                    <a:graphicFrameLocks xmlns:a="http://schemas.openxmlformats.org/drawingml/2006/main" noChangeAspect="1"/>
-                  </wp:cNvGraphicFramePr>
-                  <a:graphic xmlns:a="http://schemas.openxmlformats.org/drawingml/2006/main">
-                    <a:graphicData uri="http://schemas.openxmlformats.org/drawingml/2006/picture">
-                      <pic:pic xmlns:pic="http://schemas.openxmlformats.org/drawingml/2006/picture">
-                        <pic:nvPicPr>
-                          <pic:cNvPr id="0" name=""/>
-                          <pic:cNvPicPr/>
-                        </pic:nvPicPr>
-                        <pic:blipFill rotWithShape="1">
-                          <a:blip r:embed="rId7" cstate="print">
-                            <a:extLst>
-                              <a:ext uri="{BEBA8EAE-BF5A-486C-A8C5-ECC9F3942E4B}">
-                                <a14:imgProps xmlns:a14="http://schemas.microsoft.com/office/drawing/2010/main">
-                                  <a14:imgLayer r:embed="rId8">
-                                    <a14:imgEffect>
-                                      <a14:sharpenSoften amount="25000"/>
-                                    </a14:imgEffect>
-                                  </a14:imgLayer>
-                                </a14:imgProps>
-                              </a:ext>
-                              <a:ext uri="{28A0092B-C50C-407E-A947-70E740481C1C}">
-                                <a14:useLocalDpi xmlns:a14="http://schemas.microsoft.com/office/drawing/2010/main"/>
-                              </a:ext>
-                            </a:extLst>
-                          </a:blip>
-                          <a:srcRect/>
-                          <a:stretch/>
-                        </pic:blipFill>
-                        <pic:spPr bwMode="auto">
-                          <a:xfrm>
-                            <a:off x="0" y="0"/>
-                            <a:ext cx="371305" cy="232852"/>
-                          </a:xfrm>
-                          <a:prstGeom prst="rect">
-                            <a:avLst/>
-                          </a:prstGeom>
-                          <a:ln>
-                            <a:noFill/>
-                          </a:ln>
-                          <a:extLst>
-                            <a:ext uri="{53640926-AAD7-44D8-BBD7-CCE9431645EC}">
-                              <a14:shadowObscured xmlns:a14="http://schemas.microsoft.com/office/drawing/2010/main"/>
-                            </a:ext>
-                          </a:extLst>
-                        </pic:spPr>
-                      </pic:pic>
-                    </a:graphicData>
-                  </a:graphic>
-                </wp:inline>
-              </w:drawing>
             </w:r>
           </w:p>
         </w:tc>
@@ -7455,6 +7051,7 @@
               <w:t xml:space="preserve">Inserción Educación para la Seguridad Vial y Movilidad </w:t>
             </w:r>
             <w:proofErr w:type="spellStart"/>
+            <w:proofErr w:type="gramStart"/>
             <w:r>
               <w:rPr>
                 <w:rFonts w:ascii="Times New Roman" w:hAnsi="Times New Roman" w:cs="Times New Roman"/>
@@ -7471,6 +7068,7 @@
               <w:t>Propuesta</w:t>
             </w:r>
             <w:proofErr w:type="spellEnd"/>
+            <w:proofErr w:type="gramEnd"/>
             <w:r>
               <w:rPr>
                 <w:rFonts w:ascii="Times New Roman" w:hAnsi="Times New Roman" w:cs="Times New Roman"/>
@@ -7492,15 +7090,14 @@
           </w:tcPr>
           <w:p>
             <w:pPr>
-              <w:rPr>
-                <w:rFonts w:ascii="Times New Roman" w:hAnsi="Times New Roman" w:cs="Times New Roman"/>
-              </w:rPr>
-            </w:pPr>
-            <w:r>
-              <w:rPr>
-                <w:rFonts w:ascii="Times New Roman" w:hAnsi="Times New Roman" w:cs="Times New Roman"/>
-              </w:rPr>
-              <w:t>Produce textos informativos utilizando el proceso de escritura, elementos gramaticales apropiados (verbos, modos y tiempos) y signos de puntuación (punto y coma). I.LL.3.6.1. / I.LL.3.6.3.</w:t>
+              <w:spacing w:after="60"/>
+            </w:pPr>
+            <w:r/>
+            <w:r>
+              <w:rPr>
+                <w:rFonts w:ascii="Times New Roman" w:hAnsi="Times New Roman"/>
+              </w:rPr>
+              <w:t>I.LL.3.6.4. Escribe diferentes tipos de texto con estructuras expositivas (informe, noticia, entre otros), según su estructura, con secuencia lógica, manejo coherente de la persona y del tiempo verbal; organiza las ideas en párrafos según esquemas expositivos de comparación-contraste, problema-solución, antecedente-consecuente y causa-efecto, y utiliza conectores causales y consecutivos, proposiciones y conjunciones, y los integra en diversos tipos de textos producidos con una intención comunicativa y en un contexto determinado. (I.3., I.4.)</w:t>
             </w:r>
           </w:p>
         </w:tc>
@@ -7552,166 +7149,36 @@
           </w:tcPr>
           <w:p>
             <w:pPr>
-              <w:rPr>
-                <w:rFonts w:ascii="Times New Roman" w:hAnsi="Times New Roman" w:cs="Times New Roman"/>
-              </w:rPr>
-            </w:pPr>
-            <w:r>
-              <w:rPr>
-                <w:rFonts w:ascii="Times New Roman" w:hAnsi="Times New Roman" w:cs="Times New Roman"/>
-              </w:rPr>
-              <w:t>LL.3.5.1. Reconocer en un texto literario los elementos característicos que le dan sentido (personajes míticos, orígenes del mundo, cosmovisión).</w:t>
-            </w:r>
-          </w:p>
-          <w:p>
-            <w:pPr>
-              <w:spacing w:before="40" w:after="40"/>
-              <w:rPr>
-                <w:rFonts w:ascii="Times New Roman" w:hAnsi="Times New Roman" w:cs="Times New Roman"/>
-              </w:rPr>
-            </w:pPr>
-          </w:p>
-          <w:p>
-            <w:pPr>
-              <w:shd w:val="clear" w:color="auto" w:fill="FCE7F3"/>
-              <w:spacing w:before="40" w:after="40"/>
-              <w:rPr>
-                <w:rFonts w:ascii="Times New Roman" w:hAnsi="Times New Roman" w:cs="Times New Roman"/>
-              </w:rPr>
-            </w:pPr>
-            <w:r>
-              <w:rPr>
-                <w:rFonts w:ascii="Times New Roman" w:hAnsi="Times New Roman" w:cs="Times New Roman"/>
+              <w:spacing w:after="60"/>
+            </w:pPr>
+            <w:r/>
+            <w:r>
+              <w:rPr>
+                <w:rFonts w:ascii="Times New Roman" w:hAnsi="Times New Roman"/>
+              </w:rPr>
+              <w:t>LL.3.5.1. Reconocer en un texto literario los elementos característicos que le dan sentido.</w:t>
+            </w:r>
+          </w:p>
+          <w:p>
+            <w:pPr>
+              <w:spacing w:after="60"/>
+            </w:pPr>
+            <w:r>
+              <w:rPr>
+                <w:rFonts w:ascii="Times New Roman" w:hAnsi="Times New Roman"/>
+              </w:rPr>
+              <w:t>LL.3.5.2. Participar en discusiones sobre textos literarios con el aporte de información, experiencias y opiniones para desarrollar progresivamente la lectura crítica.</w:t>
+            </w:r>
+          </w:p>
+          <w:p>
+            <w:pPr>
+              <w:spacing w:after="40"/>
+            </w:pPr>
+            <w:r>
+              <w:rPr>
+                <w:rFonts w:ascii="Times New Roman" w:hAnsi="Times New Roman"/>
               </w:rPr>
               <w:t>CS.3.3.8. Reconocer y valorar la diversidad de identidades, la autoestima y la expresión asertiva de emociones en situaciones de interacción social y cultural.</w:t>
-            </w:r>
-            <w:r>
-              <w:rPr>
-                <w:rFonts w:ascii="Times New Roman" w:hAnsi="Times New Roman" w:cs="Times New Roman"/>
-                <w:noProof/>
-                <w:lang w:val="en-US" w:eastAsia="en-US"/>
-              </w:rPr>
-              <w:drawing>
-                <wp:inline distT="0" distB="0" distL="0" distR="0" wp14:anchorId="550BAD4D" wp14:editId="3C044893">
-                  <wp:extent cx="641916" cy="352425"/>
-                  <wp:effectExtent l="0" t="0" r="6350" b="0"/>
-                  <wp:docPr id="12" name="Imagen 12"/>
-                  <wp:cNvGraphicFramePr>
-                    <a:graphicFrameLocks xmlns:a="http://schemas.openxmlformats.org/drawingml/2006/main" noChangeAspect="1"/>
-                  </wp:cNvGraphicFramePr>
-                  <a:graphic xmlns:a="http://schemas.openxmlformats.org/drawingml/2006/main">
-                    <a:graphicData uri="http://schemas.openxmlformats.org/drawingml/2006/picture">
-                      <pic:pic xmlns:pic="http://schemas.openxmlformats.org/drawingml/2006/picture">
-                        <pic:nvPicPr>
-                          <pic:cNvPr id="0" name=""/>
-                          <pic:cNvPicPr/>
-                        </pic:nvPicPr>
-                        <pic:blipFill rotWithShape="1">
-                          <a:blip r:embed="rId13" cstate="print">
-                            <a:extLst>
-                              <a:ext uri="{BEBA8EAE-BF5A-486C-A8C5-ECC9F3942E4B}">
-                                <a14:imgProps xmlns:a14="http://schemas.microsoft.com/office/drawing/2010/main">
-                                  <a14:imgLayer r:embed="rId14">
-                                    <a14:imgEffect>
-                                      <a14:sharpenSoften amount="25000"/>
-                                    </a14:imgEffect>
-                                  </a14:imgLayer>
-                                </a14:imgProps>
-                              </a:ext>
-                              <a:ext uri="{28A0092B-C50C-407E-A947-70E740481C1C}">
-                                <a14:useLocalDpi xmlns:a14="http://schemas.microsoft.com/office/drawing/2010/main"/>
-                              </a:ext>
-                            </a:extLst>
-                          </a:blip>
-                          <a:srcRect/>
-                          <a:stretch/>
-                        </pic:blipFill>
-                        <pic:spPr bwMode="auto">
-                          <a:xfrm>
-                            <a:off x="0" y="0"/>
-                            <a:ext cx="642433" cy="352709"/>
-                          </a:xfrm>
-                          <a:prstGeom prst="rect">
-                            <a:avLst/>
-                          </a:prstGeom>
-                          <a:ln>
-                            <a:noFill/>
-                          </a:ln>
-                          <a:extLst>
-                            <a:ext uri="{53640926-AAD7-44D8-BBD7-CCE9431645EC}">
-                              <a14:shadowObscured xmlns:a14="http://schemas.microsoft.com/office/drawing/2010/main"/>
-                            </a:ext>
-                          </a:extLst>
-                        </pic:spPr>
-                      </pic:pic>
-                    </a:graphicData>
-                  </a:graphic>
-                </wp:inline>
-              </w:drawing>
-            </w:r>
-            <w:r>
-              <w:rPr>
-                <w:rFonts w:ascii="Times New Roman" w:hAnsi="Times New Roman" w:cs="Times New Roman"/>
-                <w:noProof/>
-                <w:lang w:val="en-US" w:eastAsia="en-US"/>
-              </w:rPr>
-              <w:drawing>
-                <wp:inline distT="0" distB="0" distL="0" distR="0" wp14:anchorId="4D6FD0CF" wp14:editId="55AA6765">
-                  <wp:extent cx="514350" cy="342900"/>
-                  <wp:effectExtent l="0" t="0" r="0" b="0"/>
-                  <wp:docPr id="13" name="Imagen 13"/>
-                  <wp:cNvGraphicFramePr>
-                    <a:graphicFrameLocks xmlns:a="http://schemas.openxmlformats.org/drawingml/2006/main" noChangeAspect="1"/>
-                  </wp:cNvGraphicFramePr>
-                  <a:graphic xmlns:a="http://schemas.openxmlformats.org/drawingml/2006/main">
-                    <a:graphicData uri="http://schemas.openxmlformats.org/drawingml/2006/picture">
-                      <pic:pic xmlns:pic="http://schemas.openxmlformats.org/drawingml/2006/picture">
-                        <pic:nvPicPr>
-                          <pic:cNvPr id="0" name=""/>
-                          <pic:cNvPicPr/>
-                        </pic:nvPicPr>
-                        <pic:blipFill rotWithShape="1">
-                          <a:blip r:embed="rId9" cstate="screen">
-                            <a:extLst>
-                              <a:ext uri="{BEBA8EAE-BF5A-486C-A8C5-ECC9F3942E4B}">
-                                <a14:imgProps xmlns:a14="http://schemas.microsoft.com/office/drawing/2010/main">
-                                  <a14:imgLayer r:embed="rId10">
-                                    <a14:imgEffect>
-                                      <a14:sharpenSoften amount="25000"/>
-                                    </a14:imgEffect>
-                                  </a14:imgLayer>
-                                </a14:imgProps>
-                              </a:ext>
-                              <a:ext uri="{28A0092B-C50C-407E-A947-70E740481C1C}">
-                                <a14:useLocalDpi xmlns:a14="http://schemas.microsoft.com/office/drawing/2010/main"/>
-                              </a:ext>
-                            </a:extLst>
-                          </a:blip>
-                          <a:srcRect/>
-                          <a:stretch/>
-                        </pic:blipFill>
-                        <pic:spPr bwMode="auto">
-                          <a:xfrm>
-                            <a:off x="0" y="0"/>
-                            <a:ext cx="514763" cy="343176"/>
-                          </a:xfrm>
-                          <a:prstGeom prst="rect">
-                            <a:avLst/>
-                          </a:prstGeom>
-                          <a:ln>
-                            <a:noFill/>
-                          </a:ln>
-                          <a:extLst>
-                            <a:ext uri="{53640926-AAD7-44D8-BBD7-CCE9431645EC}">
-                              <a14:shadowObscured xmlns:a14="http://schemas.microsoft.com/office/drawing/2010/main"/>
-                            </a:ext>
-                          </a:extLst>
-                        </pic:spPr>
-                      </pic:pic>
-                    </a:graphicData>
-                  </a:graphic>
-                </wp:inline>
-              </w:drawing>
             </w:r>
           </w:p>
         </w:tc>
@@ -8905,6 +8372,7 @@
               <w:t xml:space="preserve">Inserción Educación </w:t>
             </w:r>
             <w:proofErr w:type="spellStart"/>
+            <w:proofErr w:type="gramStart"/>
             <w:r>
               <w:rPr>
                 <w:rFonts w:ascii="Times New Roman" w:hAnsi="Times New Roman" w:cs="Times New Roman"/>
@@ -8921,6 +8389,7 @@
               <w:t>A</w:t>
             </w:r>
             <w:proofErr w:type="spellEnd"/>
+            <w:proofErr w:type="gramEnd"/>
             <w:r>
               <w:rPr>
                 <w:rFonts w:ascii="Times New Roman" w:hAnsi="Times New Roman" w:cs="Times New Roman"/>
@@ -8942,15 +8411,25 @@
           </w:tcPr>
           <w:p>
             <w:pPr>
-              <w:rPr>
-                <w:rFonts w:ascii="Times New Roman" w:hAnsi="Times New Roman" w:cs="Times New Roman"/>
-              </w:rPr>
-            </w:pPr>
-            <w:r>
-              <w:rPr>
-                <w:rFonts w:ascii="Times New Roman" w:hAnsi="Times New Roman" w:cs="Times New Roman"/>
-              </w:rPr>
-              <w:t>Reconoce en textos de la literatura oral y escrita (mitos) los elementos característicos que les dan sentido; participa en discusiones sobre textos literarios aportando interpretaciones personales. I.LL.3.7.1.</w:t>
+              <w:spacing w:after="60"/>
+            </w:pPr>
+            <w:r/>
+            <w:r>
+              <w:rPr>
+                <w:rFonts w:ascii="Times New Roman" w:hAnsi="Times New Roman"/>
+              </w:rPr>
+              <w:t>Reconoce en textos de literatura oral (canciones, adivinanzas, trabalenguas, retahílas, nanas, rondas, arrullos, amorfinos, chigualos) o escrita (cuentos, poemas, mitos, leyendas), los elementos característicos que les dan sentido. (Ref. I.LL.3.7.1.) (I.3., S.4.)</w:t>
+            </w:r>
+          </w:p>
+          <w:p>
+            <w:pPr>
+              <w:spacing w:after="60"/>
+            </w:pPr>
+            <w:r>
+              <w:rPr>
+                <w:rFonts w:ascii="Times New Roman" w:hAnsi="Times New Roman"/>
+              </w:rPr>
+              <w:t>I.LL.3.7.2. Elige lecturas basándose en preferencias personales de autores, géneros o temas, maneja diversos soportes para formarse como lector autónomo y participa en discusiones literarias, desarrollando progresivamente la lectura crítica. (J.4., S.4.)</w:t>
             </w:r>
           </w:p>
         </w:tc>
@@ -9002,179 +8481,36 @@
           </w:tcPr>
           <w:p>
             <w:pPr>
-              <w:rPr>
-                <w:rFonts w:ascii="Times New Roman" w:hAnsi="Times New Roman" w:cs="Times New Roman"/>
-              </w:rPr>
-            </w:pPr>
-            <w:r>
-              <w:rPr>
-                <w:rFonts w:ascii="Times New Roman" w:hAnsi="Times New Roman" w:cs="Times New Roman"/>
-              </w:rPr>
-              <w:t>LL.3.5.1. Recrear textos literarios leídos o escuchados mediante el uso de diversos formatos.</w:t>
-            </w:r>
-            <w:r>
-              <w:rPr>
-                <w:rFonts w:ascii="Times New Roman" w:hAnsi="Times New Roman" w:cs="Times New Roman"/>
-              </w:rPr>
-              <w:br/>
-            </w:r>
-            <w:r>
-              <w:rPr>
-                <w:rFonts w:ascii="Times New Roman" w:hAnsi="Times New Roman" w:cs="Times New Roman"/>
-              </w:rPr>
-              <w:br/>
-              <w:t>LL.3.4.13. Producir textos de acuerdo con la situación comunicativa en formatos variados (historieta mitológica).</w:t>
-            </w:r>
-          </w:p>
-          <w:p>
-            <w:pPr>
-              <w:spacing w:before="40" w:after="40"/>
-              <w:rPr>
-                <w:rFonts w:ascii="Times New Roman" w:hAnsi="Times New Roman" w:cs="Times New Roman"/>
-              </w:rPr>
-            </w:pPr>
-          </w:p>
-          <w:p>
-            <w:pPr>
-              <w:shd w:val="clear" w:color="auto" w:fill="DCFCE7"/>
-              <w:spacing w:before="40" w:after="40"/>
-              <w:rPr>
-                <w:rFonts w:ascii="Times New Roman" w:hAnsi="Times New Roman" w:cs="Times New Roman"/>
-              </w:rPr>
-            </w:pPr>
-            <w:r>
-              <w:rPr>
-                <w:rFonts w:ascii="Times New Roman" w:hAnsi="Times New Roman" w:cs="Times New Roman"/>
+              <w:spacing w:after="60"/>
+            </w:pPr>
+            <w:r/>
+            <w:r>
+              <w:rPr>
+                <w:rFonts w:ascii="Times New Roman" w:hAnsi="Times New Roman"/>
+              </w:rPr>
+              <w:t>LL.3.5.6. Recrear textos literarios leídos o escuchados mediante el uso de diversos medios y recursos (incluidas las TIC).</w:t>
+            </w:r>
+          </w:p>
+          <w:p>
+            <w:pPr>
+              <w:spacing w:after="60"/>
+            </w:pPr>
+            <w:r>
+              <w:rPr>
+                <w:rFonts w:ascii="Times New Roman" w:hAnsi="Times New Roman"/>
+              </w:rPr>
+              <w:t>LL.3.4.13. Producir escritos de acuerdo con la situación comunicativa, mediante el empleo de diversos formatos, recursos y materiales.</w:t>
+            </w:r>
+          </w:p>
+          <w:p>
+            <w:pPr>
+              <w:spacing w:after="40"/>
+            </w:pPr>
+            <w:r>
+              <w:rPr>
+                <w:rFonts w:ascii="Times New Roman" w:hAnsi="Times New Roman"/>
               </w:rPr>
               <w:t>CS.3.3.16. Identificar las señales de tránsito, las zonas de seguridad escolar y las medidas de prevención de accidentes viales en los desplazamientos cotidianos.</w:t>
-            </w:r>
-            <w:r>
-              <w:rPr>
-                <w:rFonts w:ascii="Times New Roman" w:hAnsi="Times New Roman" w:cs="Times New Roman"/>
-                <w:noProof/>
-                <w:lang w:val="en-US" w:eastAsia="en-US"/>
-              </w:rPr>
-              <w:drawing>
-                <wp:inline distT="0" distB="0" distL="0" distR="0" wp14:anchorId="2FF07925" wp14:editId="37645A35">
-                  <wp:extent cx="365760" cy="269508"/>
-                  <wp:effectExtent l="0" t="0" r="0" b="0"/>
-                  <wp:docPr id="14" name="Imagen 14"/>
-                  <wp:cNvGraphicFramePr>
-                    <a:graphicFrameLocks xmlns:a="http://schemas.openxmlformats.org/drawingml/2006/main" noChangeAspect="1"/>
-                  </wp:cNvGraphicFramePr>
-                  <a:graphic xmlns:a="http://schemas.openxmlformats.org/drawingml/2006/main">
-                    <a:graphicData uri="http://schemas.openxmlformats.org/drawingml/2006/picture">
-                      <pic:pic xmlns:pic="http://schemas.openxmlformats.org/drawingml/2006/picture">
-                        <pic:nvPicPr>
-                          <pic:cNvPr id="0" name=""/>
-                          <pic:cNvPicPr/>
-                        </pic:nvPicPr>
-                        <pic:blipFill rotWithShape="1">
-                          <a:blip r:embed="rId11" cstate="print">
-                            <a:extLst>
-                              <a:ext uri="{BEBA8EAE-BF5A-486C-A8C5-ECC9F3942E4B}">
-                                <a14:imgProps xmlns:a14="http://schemas.microsoft.com/office/drawing/2010/main">
-                                  <a14:imgLayer r:embed="rId12">
-                                    <a14:imgEffect>
-                                      <a14:sharpenSoften amount="25000"/>
-                                    </a14:imgEffect>
-                                  </a14:imgLayer>
-                                </a14:imgProps>
-                              </a:ext>
-                              <a:ext uri="{28A0092B-C50C-407E-A947-70E740481C1C}">
-                                <a14:useLocalDpi xmlns:a14="http://schemas.microsoft.com/office/drawing/2010/main"/>
-                              </a:ext>
-                            </a:extLst>
-                          </a:blip>
-                          <a:srcRect/>
-                          <a:stretch/>
-                        </pic:blipFill>
-                        <pic:spPr bwMode="auto">
-                          <a:xfrm>
-                            <a:off x="0" y="0"/>
-                            <a:ext cx="367978" cy="271143"/>
-                          </a:xfrm>
-                          <a:prstGeom prst="rect">
-                            <a:avLst/>
-                          </a:prstGeom>
-                          <a:ln>
-                            <a:noFill/>
-                          </a:ln>
-                          <a:extLst>
-                            <a:ext uri="{53640926-AAD7-44D8-BBD7-CCE9431645EC}">
-                              <a14:shadowObscured xmlns:a14="http://schemas.microsoft.com/office/drawing/2010/main"/>
-                            </a:ext>
-                          </a:extLst>
-                        </pic:spPr>
-                      </pic:pic>
-                    </a:graphicData>
-                  </a:graphic>
-                </wp:inline>
-              </w:drawing>
-            </w:r>
-            <w:r>
-              <w:rPr>
-                <w:rFonts w:ascii="Times New Roman" w:hAnsi="Times New Roman" w:cs="Times New Roman"/>
-                <w:noProof/>
-                <w:lang w:val="en-US" w:eastAsia="en-US"/>
-              </w:rPr>
-              <w:drawing>
-                <wp:inline distT="0" distB="0" distL="0" distR="0" wp14:anchorId="6A4D991F" wp14:editId="3DF82064">
-                  <wp:extent cx="365760" cy="229375"/>
-                  <wp:effectExtent l="0" t="0" r="0" b="0"/>
-                  <wp:docPr id="15" name="Imagen 15"/>
-                  <wp:cNvGraphicFramePr>
-                    <a:graphicFrameLocks xmlns:a="http://schemas.openxmlformats.org/drawingml/2006/main" noChangeAspect="1"/>
-                  </wp:cNvGraphicFramePr>
-                  <a:graphic xmlns:a="http://schemas.openxmlformats.org/drawingml/2006/main">
-                    <a:graphicData uri="http://schemas.openxmlformats.org/drawingml/2006/picture">
-                      <pic:pic xmlns:pic="http://schemas.openxmlformats.org/drawingml/2006/picture">
-                        <pic:nvPicPr>
-                          <pic:cNvPr id="0" name=""/>
-                          <pic:cNvPicPr/>
-                        </pic:nvPicPr>
-                        <pic:blipFill rotWithShape="1">
-                          <a:blip r:embed="rId7" cstate="print">
-                            <a:extLst>
-                              <a:ext uri="{BEBA8EAE-BF5A-486C-A8C5-ECC9F3942E4B}">
-                                <a14:imgProps xmlns:a14="http://schemas.microsoft.com/office/drawing/2010/main">
-                                  <a14:imgLayer r:embed="rId8">
-                                    <a14:imgEffect>
-                                      <a14:sharpenSoften amount="25000"/>
-                                    </a14:imgEffect>
-                                  </a14:imgLayer>
-                                </a14:imgProps>
-                              </a:ext>
-                              <a:ext uri="{28A0092B-C50C-407E-A947-70E740481C1C}">
-                                <a14:useLocalDpi xmlns:a14="http://schemas.microsoft.com/office/drawing/2010/main"/>
-                              </a:ext>
-                            </a:extLst>
-                          </a:blip>
-                          <a:srcRect/>
-                          <a:stretch/>
-                        </pic:blipFill>
-                        <pic:spPr bwMode="auto">
-                          <a:xfrm>
-                            <a:off x="0" y="0"/>
-                            <a:ext cx="371305" cy="232852"/>
-                          </a:xfrm>
-                          <a:prstGeom prst="rect">
-                            <a:avLst/>
-                          </a:prstGeom>
-                          <a:ln>
-                            <a:noFill/>
-                          </a:ln>
-                          <a:extLst>
-                            <a:ext uri="{53640926-AAD7-44D8-BBD7-CCE9431645EC}">
-                              <a14:shadowObscured xmlns:a14="http://schemas.microsoft.com/office/drawing/2010/main"/>
-                            </a:ext>
-                          </a:extLst>
-                        </pic:spPr>
-                      </pic:pic>
-                    </a:graphicData>
-                  </a:graphic>
-                </wp:inline>
-              </w:drawing>
             </w:r>
           </w:p>
         </w:tc>
@@ -10361,6 +9697,7 @@
               <w:t xml:space="preserve">Inserción Educación para la Seguridad Vial y Movilidad </w:t>
             </w:r>
             <w:proofErr w:type="spellStart"/>
+            <w:proofErr w:type="gramStart"/>
             <w:r>
               <w:rPr>
                 <w:rFonts w:ascii="Times New Roman" w:hAnsi="Times New Roman" w:cs="Times New Roman"/>
@@ -10377,6 +9714,7 @@
               <w:t>Los</w:t>
             </w:r>
             <w:proofErr w:type="spellEnd"/>
+            <w:proofErr w:type="gramEnd"/>
             <w:r>
               <w:rPr>
                 <w:rFonts w:ascii="Times New Roman" w:hAnsi="Times New Roman" w:cs="Times New Roman"/>
@@ -10398,15 +9736,25 @@
           </w:tcPr>
           <w:p>
             <w:pPr>
-              <w:rPr>
-                <w:rFonts w:ascii="Times New Roman" w:hAnsi="Times New Roman" w:cs="Times New Roman"/>
-              </w:rPr>
-            </w:pPr>
-            <w:r>
-              <w:rPr>
-                <w:rFonts w:ascii="Times New Roman" w:hAnsi="Times New Roman" w:cs="Times New Roman"/>
-              </w:rPr>
-              <w:t>Recrea textos literarios leídos mediante adaptaciones creativas (historieta) y demuestra el dominio de destrezas comunicativas de la Unidad 1. I.LL.3.7.2. / I.LL.3.6.1.</w:t>
+              <w:spacing w:after="60"/>
+            </w:pPr>
+            <w:r/>
+            <w:r>
+              <w:rPr>
+                <w:rFonts w:ascii="Times New Roman" w:hAnsi="Times New Roman"/>
+              </w:rPr>
+              <w:t>I.LL.3.8.1. Reinventa textos literarios, reconociendo la fuente original, los relaciona con el contexto cultural propio y de otros entornos, incorpora recursos del lenguaje figurado y usa diversos medios y recursos (incluidas las TIC) para recrearlos. (J.2., I.2.)</w:t>
+            </w:r>
+          </w:p>
+          <w:p>
+            <w:pPr>
+              <w:spacing w:after="60"/>
+            </w:pPr>
+            <w:r>
+              <w:rPr>
+                <w:rFonts w:ascii="Times New Roman" w:hAnsi="Times New Roman"/>
+              </w:rPr>
+              <w:t>I.LL.3.6.4. Escribe diferentes tipos de texto con secuencia lógica, manejo coherente y los integra en diversos tipos de textos producidos con una intención comunicativa y en un contexto determinado. (I.3., I.4.)</w:t>
             </w:r>
           </w:p>
         </w:tc>
@@ -10724,7 +10072,6 @@
             <w:shd w:val="clear" w:color="auto" w:fill="FFFFFF" w:themeFill="background1"/>
           </w:tcPr>
           <w:p>
-            <w:r/>
             <w:r>
               <w:rPr>
                 <w:rFonts w:ascii="Times New Roman" w:hAnsi="Times New Roman"/>
@@ -10732,12 +10079,18 @@
                 <w:sz w:val="20"/>
               </w:rPr>
               <w:t>Coordinador/a del área/año:</w:t>
+            </w:r>
+            <w:r>
+              <w:rPr>
+                <w:rFonts w:ascii="Times New Roman" w:hAnsi="Times New Roman"/>
+                <w:b/>
+                <w:sz w:val="20"/>
+              </w:rPr>
               <w:br/>
             </w:r>
             <w:r>
               <w:rPr>
                 <w:rFonts w:ascii="Times New Roman" w:hAnsi="Times New Roman"/>
-                <w:b w:val="0"/>
                 <w:sz w:val="20"/>
               </w:rPr>
               <w:t>MSc. Mery Díaz</w:t>
@@ -10755,25 +10108,69 @@
             <w:shd w:val="clear" w:color="auto" w:fill="FFFFFF" w:themeFill="background1"/>
           </w:tcPr>
           <w:p>
-            <w:r/>
             <w:r>
               <w:rPr>
                 <w:rFonts w:ascii="Times New Roman" w:hAnsi="Times New Roman"/>
                 <w:b/>
                 <w:sz w:val="20"/>
               </w:rPr>
-              <w:t>Junta de Directores:</w:t>
+              <w:t xml:space="preserve">Junta de </w:t>
+            </w:r>
+            <w:proofErr w:type="gramStart"/>
+            <w:r>
+              <w:rPr>
+                <w:rFonts w:ascii="Times New Roman" w:hAnsi="Times New Roman"/>
+                <w:b/>
+                <w:sz w:val="20"/>
+              </w:rPr>
+              <w:t>Directores</w:t>
+            </w:r>
+            <w:proofErr w:type="gramEnd"/>
+            <w:r>
+              <w:rPr>
+                <w:rFonts w:ascii="Times New Roman" w:hAnsi="Times New Roman"/>
+                <w:b/>
+                <w:sz w:val="20"/>
+              </w:rPr>
+              <w:t>:</w:t>
+            </w:r>
+            <w:r>
+              <w:rPr>
+                <w:rFonts w:ascii="Times New Roman" w:hAnsi="Times New Roman"/>
+                <w:b/>
+                <w:sz w:val="20"/>
+              </w:rPr>
               <w:br/>
             </w:r>
             <w:r>
               <w:rPr>
                 <w:rFonts w:ascii="Times New Roman" w:hAnsi="Times New Roman"/>
-                <w:b w:val="0"/>
                 <w:sz w:val="20"/>
               </w:rPr>
               <w:t>MSc. Isabel Valencia</w:t>
+            </w:r>
+            <w:r>
+              <w:rPr>
+                <w:rFonts w:ascii="Times New Roman" w:hAnsi="Times New Roman"/>
+                <w:sz w:val="20"/>
+              </w:rPr>
               <w:br/>
-              <w:t>Directora de Subnivel</w:t>
+            </w:r>
+            <w:proofErr w:type="gramStart"/>
+            <w:r>
+              <w:rPr>
+                <w:rFonts w:ascii="Times New Roman" w:hAnsi="Times New Roman"/>
+                <w:sz w:val="20"/>
+              </w:rPr>
+              <w:t>Directora</w:t>
+            </w:r>
+            <w:proofErr w:type="gramEnd"/>
+            <w:r>
+              <w:rPr>
+                <w:rFonts w:ascii="Times New Roman" w:hAnsi="Times New Roman"/>
+                <w:sz w:val="20"/>
+              </w:rPr>
+              <w:t xml:space="preserve"> de Subnivel</w:t>
             </w:r>
           </w:p>
         </w:tc>

</xml_diff>

<commit_message>
fix(curriculo): separar iconos de competencias en destrezas e iconos oficiales en inserciones curriculares sin duplicidad
</commit_message>
<xml_diff>
--- a/PLANIFICACION_MICROCURRICULAR_7MO_LENGUA_1ER_TRIMESTRE final.docx
+++ b/PLANIFICACION_MICROCURRICULAR_7MO_LENGUA_1ER_TRIMESTRE final.docx
@@ -1593,25 +1593,118 @@
           </w:tcPr>
           <w:p>
             <w:pPr>
+              <w:spacing w:after="40"/>
+            </w:pPr>
+            <w:r/>
+            <w:r>
+              <w:rPr>
+                <w:rFonts w:ascii="Times New Roman" w:hAnsi="Times New Roman"/>
+              </w:rPr>
+              <w:t>LL.3.1.1. Participar en contextos y situaciones que evidencien la funcionalidad de la lengua escrita como herramienta cultural.</w:t>
+            </w:r>
+          </w:p>
+          <w:p>
+            <w:pPr>
+              <w:spacing w:after="80" w:before="40"/>
+            </w:pPr>
+            <w:r>
+              <w:drawing>
+                <wp:inline xmlns:a="http://schemas.openxmlformats.org/drawingml/2006/main" xmlns:pic="http://schemas.openxmlformats.org/drawingml/2006/picture">
+                  <wp:extent cx="347472" cy="163342"/>
+                  <wp:docPr id="76" name="Picture 76"/>
+                  <wp:cNvGraphicFramePr>
+                    <a:graphicFrameLocks noChangeAspect="1"/>
+                  </wp:cNvGraphicFramePr>
+                  <a:graphic>
+                    <a:graphicData uri="http://schemas.openxmlformats.org/drawingml/2006/picture">
+                      <pic:pic>
+                        <pic:nvPicPr>
+                          <pic:cNvPr id="0" name="image.png"/>
+                          <pic:cNvPicPr/>
+                        </pic:nvPicPr>
+                        <pic:blipFill>
+                          <a:blip r:embed="rId7"/>
+                          <a:stretch>
+                            <a:fillRect/>
+                          </a:stretch>
+                        </pic:blipFill>
+                        <pic:spPr>
+                          <a:xfrm>
+                            <a:off x="0" y="0"/>
+                            <a:ext cx="347472" cy="163342"/>
+                          </a:xfrm>
+                          <a:prstGeom prst="rect"/>
+                        </pic:spPr>
+                      </pic:pic>
+                    </a:graphicData>
+                  </a:graphic>
+                </wp:inline>
+              </w:drawing>
+            </w:r>
+            <w:r>
+              <w:t xml:space="preserve">  </w:t>
+            </w:r>
+          </w:p>
+          <w:p>
+            <w:pPr>
+              <w:spacing w:after="20"/>
+            </w:pPr>
+            <w:r>
+              <w:rPr>
+                <w:rFonts w:ascii="Times New Roman" w:hAnsi="Times New Roman"/>
+                <w:b/>
+              </w:rPr>
+              <w:t>✦ INSERCIÓN CURRICULAR: EDUCACIÓN CÍVICA, ÉTICA E INTEGRIDAD</w:t>
+            </w:r>
+          </w:p>
+          <w:p>
+            <w:pPr>
+              <w:spacing w:after="40"/>
+            </w:pPr>
+            <w:r>
+              <w:rPr>
+                <w:rFonts w:ascii="Times New Roman" w:hAnsi="Times New Roman"/>
+              </w:rPr>
+              <w:t>CS.3.2.22. Reconocer y practicar la honestidad, la integridad y el respeto a los acuerdos y normas como valores fundamentales en la vida personal, escolar y comunitaria.</w:t>
+            </w:r>
+          </w:p>
+          <w:p>
+            <w:pPr>
               <w:spacing w:after="60"/>
             </w:pPr>
-            <w:r/>
-            <w:r>
-              <w:rPr>
-                <w:rFonts w:ascii="Times New Roman" w:hAnsi="Times New Roman"/>
-              </w:rPr>
-              <w:t>LL.3.1.1. Participar en contextos y situaciones que evidencien la funcionalidad de la lengua escrita como herramienta cultural.</w:t>
-            </w:r>
-          </w:p>
-          <w:p>
-            <w:pPr>
-              <w:spacing w:after="40"/>
-            </w:pPr>
-            <w:r>
-              <w:rPr>
-                <w:rFonts w:ascii="Times New Roman" w:hAnsi="Times New Roman"/>
-              </w:rPr>
-              <w:t>CS.3.2.22. Reconocer y practicar la honestidad, la integridad y el respeto a los acuerdos y normas como valores fundamentales en la vida personal, escolar y comunitaria.</w:t>
+            <w:r>
+              <w:drawing>
+                <wp:inline xmlns:a="http://schemas.openxmlformats.org/drawingml/2006/main" xmlns:pic="http://schemas.openxmlformats.org/drawingml/2006/picture">
+                  <wp:extent cx="329184" cy="314661"/>
+                  <wp:docPr id="77" name="Picture 77"/>
+                  <wp:cNvGraphicFramePr>
+                    <a:graphicFrameLocks noChangeAspect="1"/>
+                  </wp:cNvGraphicFramePr>
+                  <a:graphic>
+                    <a:graphicData uri="http://schemas.openxmlformats.org/drawingml/2006/picture">
+                      <pic:pic>
+                        <pic:nvPicPr>
+                          <pic:cNvPr id="0" name="image.png"/>
+                          <pic:cNvPicPr/>
+                        </pic:nvPicPr>
+                        <pic:blipFill>
+                          <a:blip r:embed="rId17"/>
+                          <a:stretch>
+                            <a:fillRect/>
+                          </a:stretch>
+                        </pic:blipFill>
+                        <pic:spPr>
+                          <a:xfrm>
+                            <a:off x="0" y="0"/>
+                            <a:ext cx="329184" cy="314661"/>
+                          </a:xfrm>
+                          <a:prstGeom prst="rect"/>
+                        </pic:spPr>
+                      </pic:pic>
+                    </a:graphicData>
+                  </a:graphic>
+                </wp:inline>
+              </w:drawing>
             </w:r>
           </w:p>
         </w:tc>
@@ -2879,25 +2972,118 @@
           </w:tcPr>
           <w:p>
             <w:pPr>
+              <w:spacing w:after="40"/>
+            </w:pPr>
+            <w:r/>
+            <w:r>
+              <w:rPr>
+                <w:rFonts w:ascii="Times New Roman" w:hAnsi="Times New Roman"/>
+              </w:rPr>
+              <w:t>LL.3.2.1. Escuchar discursos orales y formular juicios de valor con respecto a su contenido y forma, y participar de manera respetuosa frente a las intervenciones de los demás.</w:t>
+            </w:r>
+          </w:p>
+          <w:p>
+            <w:pPr>
+              <w:spacing w:after="80" w:before="40"/>
+            </w:pPr>
+            <w:r>
+              <w:drawing>
+                <wp:inline xmlns:a="http://schemas.openxmlformats.org/drawingml/2006/main" xmlns:pic="http://schemas.openxmlformats.org/drawingml/2006/picture">
+                  <wp:extent cx="347472" cy="163342"/>
+                  <wp:docPr id="78" name="Picture 78"/>
+                  <wp:cNvGraphicFramePr>
+                    <a:graphicFrameLocks noChangeAspect="1"/>
+                  </wp:cNvGraphicFramePr>
+                  <a:graphic>
+                    <a:graphicData uri="http://schemas.openxmlformats.org/drawingml/2006/picture">
+                      <pic:pic>
+                        <pic:nvPicPr>
+                          <pic:cNvPr id="0" name="image.png"/>
+                          <pic:cNvPicPr/>
+                        </pic:nvPicPr>
+                        <pic:blipFill>
+                          <a:blip r:embed="rId7"/>
+                          <a:stretch>
+                            <a:fillRect/>
+                          </a:stretch>
+                        </pic:blipFill>
+                        <pic:spPr>
+                          <a:xfrm>
+                            <a:off x="0" y="0"/>
+                            <a:ext cx="347472" cy="163342"/>
+                          </a:xfrm>
+                          <a:prstGeom prst="rect"/>
+                        </pic:spPr>
+                      </pic:pic>
+                    </a:graphicData>
+                  </a:graphic>
+                </wp:inline>
+              </w:drawing>
+            </w:r>
+            <w:r>
+              <w:t xml:space="preserve">  </w:t>
+            </w:r>
+          </w:p>
+          <w:p>
+            <w:pPr>
+              <w:spacing w:after="20"/>
+            </w:pPr>
+            <w:r>
+              <w:rPr>
+                <w:rFonts w:ascii="Times New Roman" w:hAnsi="Times New Roman"/>
+                <w:b/>
+              </w:rPr>
+              <w:t>✦ INSERCIÓN CURRICULAR: EDUCACIÓN SOCIOEMOCIONAL</w:t>
+            </w:r>
+          </w:p>
+          <w:p>
+            <w:pPr>
+              <w:spacing w:after="40"/>
+            </w:pPr>
+            <w:r>
+              <w:rPr>
+                <w:rFonts w:ascii="Times New Roman" w:hAnsi="Times New Roman"/>
+              </w:rPr>
+              <w:t>CS.3.3.9. Destacar y aplicar la empatía, el diálogo reflexivo y la autorregulación emocional en los espacios escolares y familiares para una resolución pacífica de conflictos.</w:t>
+            </w:r>
+          </w:p>
+          <w:p>
+            <w:pPr>
               <w:spacing w:after="60"/>
             </w:pPr>
-            <w:r/>
-            <w:r>
-              <w:rPr>
-                <w:rFonts w:ascii="Times New Roman" w:hAnsi="Times New Roman"/>
-              </w:rPr>
-              <w:t>LL.3.2.1. Escuchar discursos orales y formular juicios de valor con respecto a su contenido y forma, y participar de manera respetuosa frente a las intervenciones de los demás.</w:t>
-            </w:r>
-          </w:p>
-          <w:p>
-            <w:pPr>
-              <w:spacing w:after="40"/>
-            </w:pPr>
-            <w:r>
-              <w:rPr>
-                <w:rFonts w:ascii="Times New Roman" w:hAnsi="Times New Roman"/>
-              </w:rPr>
-              <w:t>CS.3.3.9. Destacar y aplicar la empatía, el diálogo reflexivo y la autorregulación emocional en los espacios escolares y familiares para una resolución pacífica de conflictos.</w:t>
+            <w:r>
+              <w:drawing>
+                <wp:inline xmlns:a="http://schemas.openxmlformats.org/drawingml/2006/main" xmlns:pic="http://schemas.openxmlformats.org/drawingml/2006/picture">
+                  <wp:extent cx="329184" cy="318897"/>
+                  <wp:docPr id="79" name="Picture 79"/>
+                  <wp:cNvGraphicFramePr>
+                    <a:graphicFrameLocks noChangeAspect="1"/>
+                  </wp:cNvGraphicFramePr>
+                  <a:graphic>
+                    <a:graphicData uri="http://schemas.openxmlformats.org/drawingml/2006/picture">
+                      <pic:pic>
+                        <pic:nvPicPr>
+                          <pic:cNvPr id="0" name="image.png"/>
+                          <pic:cNvPicPr/>
+                        </pic:nvPicPr>
+                        <pic:blipFill>
+                          <a:blip r:embed="rId18"/>
+                          <a:stretch>
+                            <a:fillRect/>
+                          </a:stretch>
+                        </pic:blipFill>
+                        <pic:spPr>
+                          <a:xfrm>
+                            <a:off x="0" y="0"/>
+                            <a:ext cx="329184" cy="318897"/>
+                          </a:xfrm>
+                          <a:prstGeom prst="rect"/>
+                        </pic:spPr>
+                      </pic:pic>
+                    </a:graphicData>
+                  </a:graphic>
+                </wp:inline>
+              </w:drawing>
             </w:r>
           </w:p>
         </w:tc>
@@ -4483,36 +4669,166 @@
           </w:tcPr>
           <w:p>
             <w:pPr>
+              <w:spacing w:after="40"/>
+            </w:pPr>
+            <w:r/>
+            <w:r>
+              <w:rPr>
+                <w:rFonts w:ascii="Times New Roman" w:hAnsi="Times New Roman"/>
+              </w:rPr>
+              <w:t>LL.3.3.5. Valorar los aspectos de forma y el contenido de un texto, a partir de criterios preestablecidos.</w:t>
+            </w:r>
+          </w:p>
+          <w:p>
+            <w:pPr>
+              <w:spacing w:after="40"/>
+            </w:pPr>
+            <w:r>
+              <w:rPr>
+                <w:rFonts w:ascii="Times New Roman" w:hAnsi="Times New Roman"/>
+              </w:rPr>
+              <w:t>LL.3.3.8. Leer con fluidez y entonación en diversos contextos (familiares, escolares y sociales) y con diferentes propósitos (exponer, informar, narrar, compartir, etc.).</w:t>
+            </w:r>
+          </w:p>
+          <w:p>
+            <w:pPr>
+              <w:spacing w:after="80" w:before="40"/>
+            </w:pPr>
+            <w:r>
+              <w:drawing>
+                <wp:inline xmlns:a="http://schemas.openxmlformats.org/drawingml/2006/main" xmlns:pic="http://schemas.openxmlformats.org/drawingml/2006/picture">
+                  <wp:extent cx="347472" cy="163342"/>
+                  <wp:docPr id="80" name="Picture 80"/>
+                  <wp:cNvGraphicFramePr>
+                    <a:graphicFrameLocks noChangeAspect="1"/>
+                  </wp:cNvGraphicFramePr>
+                  <a:graphic>
+                    <a:graphicData uri="http://schemas.openxmlformats.org/drawingml/2006/picture">
+                      <pic:pic>
+                        <pic:nvPicPr>
+                          <pic:cNvPr id="0" name="image.png"/>
+                          <pic:cNvPicPr/>
+                        </pic:nvPicPr>
+                        <pic:blipFill>
+                          <a:blip r:embed="rId7"/>
+                          <a:stretch>
+                            <a:fillRect/>
+                          </a:stretch>
+                        </pic:blipFill>
+                        <pic:spPr>
+                          <a:xfrm>
+                            <a:off x="0" y="0"/>
+                            <a:ext cx="347472" cy="163342"/>
+                          </a:xfrm>
+                          <a:prstGeom prst="rect"/>
+                        </pic:spPr>
+                      </pic:pic>
+                    </a:graphicData>
+                  </a:graphic>
+                </wp:inline>
+              </w:drawing>
+            </w:r>
+            <w:r>
+              <w:t xml:space="preserve">  </w:t>
+            </w:r>
+            <w:r>
+              <w:drawing>
+                <wp:inline xmlns:a="http://schemas.openxmlformats.org/drawingml/2006/main" xmlns:pic="http://schemas.openxmlformats.org/drawingml/2006/picture">
+                  <wp:extent cx="347472" cy="255612"/>
+                  <wp:docPr id="81" name="Picture 81"/>
+                  <wp:cNvGraphicFramePr>
+                    <a:graphicFrameLocks noChangeAspect="1"/>
+                  </wp:cNvGraphicFramePr>
+                  <a:graphic>
+                    <a:graphicData uri="http://schemas.openxmlformats.org/drawingml/2006/picture">
+                      <pic:pic>
+                        <pic:nvPicPr>
+                          <pic:cNvPr id="0" name="image.png"/>
+                          <pic:cNvPicPr/>
+                        </pic:nvPicPr>
+                        <pic:blipFill>
+                          <a:blip r:embed="rId11"/>
+                          <a:stretch>
+                            <a:fillRect/>
+                          </a:stretch>
+                        </pic:blipFill>
+                        <pic:spPr>
+                          <a:xfrm>
+                            <a:off x="0" y="0"/>
+                            <a:ext cx="347472" cy="255612"/>
+                          </a:xfrm>
+                          <a:prstGeom prst="rect"/>
+                        </pic:spPr>
+                      </pic:pic>
+                    </a:graphicData>
+                  </a:graphic>
+                </wp:inline>
+              </w:drawing>
+            </w:r>
+            <w:r>
+              <w:t xml:space="preserve">  </w:t>
+            </w:r>
+          </w:p>
+          <w:p>
+            <w:pPr>
+              <w:spacing w:after="20"/>
+            </w:pPr>
+            <w:r>
+              <w:rPr>
+                <w:rFonts w:ascii="Times New Roman" w:hAnsi="Times New Roman"/>
+                <w:b/>
+              </w:rPr>
+              <w:t>✦ INSERCIÓN CURRICULAR: EDUCACIÓN CÍVICA, ÉTICA E INTEGRIDAD</w:t>
+            </w:r>
+          </w:p>
+          <w:p>
+            <w:pPr>
+              <w:spacing w:after="40"/>
+            </w:pPr>
+            <w:r>
+              <w:rPr>
+                <w:rFonts w:ascii="Times New Roman" w:hAnsi="Times New Roman"/>
+              </w:rPr>
+              <w:t>CS.3.2.19. Establecer las ventajas de la organización comunitaria, la honestidad y el diálogo democrático como mecanismos para resolver problemas y fortalecer la integridad colectiva.</w:t>
+            </w:r>
+          </w:p>
+          <w:p>
+            <w:pPr>
               <w:spacing w:after="60"/>
             </w:pPr>
-            <w:r/>
-            <w:r>
-              <w:rPr>
-                <w:rFonts w:ascii="Times New Roman" w:hAnsi="Times New Roman"/>
-              </w:rPr>
-              <w:t>LL.3.3.5. Valorar los aspectos de forma y el contenido de un texto, a partir de criterios preestablecidos.</w:t>
-            </w:r>
-          </w:p>
-          <w:p>
-            <w:pPr>
-              <w:spacing w:after="60"/>
-            </w:pPr>
-            <w:r>
-              <w:rPr>
-                <w:rFonts w:ascii="Times New Roman" w:hAnsi="Times New Roman"/>
-              </w:rPr>
-              <w:t>LL.3.3.8. Leer con fluidez y entonación en diversos contextos (familiares, escolares y sociales) y con diferentes propósitos (exponer, informar, narrar, compartir, etc.).</w:t>
-            </w:r>
-          </w:p>
-          <w:p>
-            <w:pPr>
-              <w:spacing w:after="40"/>
-            </w:pPr>
-            <w:r>
-              <w:rPr>
-                <w:rFonts w:ascii="Times New Roman" w:hAnsi="Times New Roman"/>
-              </w:rPr>
-              <w:t>CS.3.2.19. Establecer las ventajas de la organización comunitaria, la honestidad y el diálogo democrático como mecanismos para resolver problemas y fortalecer la integridad colectiva.</w:t>
+            <w:r>
+              <w:drawing>
+                <wp:inline xmlns:a="http://schemas.openxmlformats.org/drawingml/2006/main" xmlns:pic="http://schemas.openxmlformats.org/drawingml/2006/picture">
+                  <wp:extent cx="329184" cy="314661"/>
+                  <wp:docPr id="82" name="Picture 82"/>
+                  <wp:cNvGraphicFramePr>
+                    <a:graphicFrameLocks noChangeAspect="1"/>
+                  </wp:cNvGraphicFramePr>
+                  <a:graphic>
+                    <a:graphicData uri="http://schemas.openxmlformats.org/drawingml/2006/picture">
+                      <pic:pic>
+                        <pic:nvPicPr>
+                          <pic:cNvPr id="0" name="image.png"/>
+                          <pic:cNvPicPr/>
+                        </pic:nvPicPr>
+                        <pic:blipFill>
+                          <a:blip r:embed="rId17"/>
+                          <a:stretch>
+                            <a:fillRect/>
+                          </a:stretch>
+                        </pic:blipFill>
+                        <pic:spPr>
+                          <a:xfrm>
+                            <a:off x="0" y="0"/>
+                            <a:ext cx="329184" cy="314661"/>
+                          </a:xfrm>
+                          <a:prstGeom prst="rect"/>
+                        </pic:spPr>
+                      </pic:pic>
+                    </a:graphicData>
+                  </a:graphic>
+                </wp:inline>
+              </w:drawing>
             </w:r>
           </w:p>
         </w:tc>
@@ -5790,47 +6106,177 @@
           </w:tcPr>
           <w:p>
             <w:pPr>
+              <w:spacing w:after="40"/>
+            </w:pPr>
+            <w:r/>
+            <w:r>
+              <w:rPr>
+                <w:rFonts w:ascii="Times New Roman" w:hAnsi="Times New Roman"/>
+              </w:rPr>
+              <w:t>LL.3.4.1. Relatar textos con secuencia lógica, manejo de conectores y coherencia en el uso de la persona y tiempo verbal, e integrarlos en diversas situaciones comunicativas.</w:t>
+            </w:r>
+          </w:p>
+          <w:p>
+            <w:pPr>
+              <w:spacing w:after="40"/>
+            </w:pPr>
+            <w:r>
+              <w:rPr>
+                <w:rFonts w:ascii="Times New Roman" w:hAnsi="Times New Roman"/>
+              </w:rPr>
+              <w:t>LL.3.4.6. Autorregular la producción escrita mediante el uso habitual del procedimiento de planificación, redacción y revisión del texto.</w:t>
+            </w:r>
+          </w:p>
+          <w:p>
+            <w:pPr>
+              <w:spacing w:after="40"/>
+            </w:pPr>
+            <w:r>
+              <w:rPr>
+                <w:rFonts w:ascii="Times New Roman" w:hAnsi="Times New Roman"/>
+              </w:rPr>
+              <w:t>LL.3.4.10. Expresar sus ideas con precisión e integrar en las producciones escritas los diferentes tipos de sustantivo, pronombre, adjetivo, verbo, adverbio y sus modificadores.</w:t>
+            </w:r>
+          </w:p>
+          <w:p>
+            <w:pPr>
+              <w:spacing w:after="80" w:before="40"/>
+            </w:pPr>
+            <w:r>
+              <w:drawing>
+                <wp:inline xmlns:a="http://schemas.openxmlformats.org/drawingml/2006/main" xmlns:pic="http://schemas.openxmlformats.org/drawingml/2006/picture">
+                  <wp:extent cx="347472" cy="163342"/>
+                  <wp:docPr id="83" name="Picture 83"/>
+                  <wp:cNvGraphicFramePr>
+                    <a:graphicFrameLocks noChangeAspect="1"/>
+                  </wp:cNvGraphicFramePr>
+                  <a:graphic>
+                    <a:graphicData uri="http://schemas.openxmlformats.org/drawingml/2006/picture">
+                      <pic:pic>
+                        <pic:nvPicPr>
+                          <pic:cNvPr id="0" name="image.png"/>
+                          <pic:cNvPicPr/>
+                        </pic:nvPicPr>
+                        <pic:blipFill>
+                          <a:blip r:embed="rId7"/>
+                          <a:stretch>
+                            <a:fillRect/>
+                          </a:stretch>
+                        </pic:blipFill>
+                        <pic:spPr>
+                          <a:xfrm>
+                            <a:off x="0" y="0"/>
+                            <a:ext cx="347472" cy="163342"/>
+                          </a:xfrm>
+                          <a:prstGeom prst="rect"/>
+                        </pic:spPr>
+                      </pic:pic>
+                    </a:graphicData>
+                  </a:graphic>
+                </wp:inline>
+              </w:drawing>
+            </w:r>
+            <w:r>
+              <w:t xml:space="preserve">  </w:t>
+            </w:r>
+            <w:r>
+              <w:drawing>
+                <wp:inline xmlns:a="http://schemas.openxmlformats.org/drawingml/2006/main" xmlns:pic="http://schemas.openxmlformats.org/drawingml/2006/picture">
+                  <wp:extent cx="347472" cy="231648"/>
+                  <wp:docPr id="84" name="Picture 84"/>
+                  <wp:cNvGraphicFramePr>
+                    <a:graphicFrameLocks noChangeAspect="1"/>
+                  </wp:cNvGraphicFramePr>
+                  <a:graphic>
+                    <a:graphicData uri="http://schemas.openxmlformats.org/drawingml/2006/picture">
+                      <pic:pic>
+                        <pic:nvPicPr>
+                          <pic:cNvPr id="0" name="image.png"/>
+                          <pic:cNvPicPr/>
+                        </pic:nvPicPr>
+                        <pic:blipFill>
+                          <a:blip r:embed="rId9"/>
+                          <a:stretch>
+                            <a:fillRect/>
+                          </a:stretch>
+                        </pic:blipFill>
+                        <pic:spPr>
+                          <a:xfrm>
+                            <a:off x="0" y="0"/>
+                            <a:ext cx="347472" cy="231648"/>
+                          </a:xfrm>
+                          <a:prstGeom prst="rect"/>
+                        </pic:spPr>
+                      </pic:pic>
+                    </a:graphicData>
+                  </a:graphic>
+                </wp:inline>
+              </w:drawing>
+            </w:r>
+            <w:r>
+              <w:t xml:space="preserve">  </w:t>
+            </w:r>
+          </w:p>
+          <w:p>
+            <w:pPr>
+              <w:spacing w:after="20"/>
+            </w:pPr>
+            <w:r>
+              <w:rPr>
+                <w:rFonts w:ascii="Times New Roman" w:hAnsi="Times New Roman"/>
+                <w:b/>
+              </w:rPr>
+              <w:t>✦ INSERCIÓN CURRICULAR: EDUCACIÓN PARA LA SEGURIDAD VIAL Y MOVILIDAD SOSTENIBLE</w:t>
+            </w:r>
+          </w:p>
+          <w:p>
+            <w:pPr>
+              <w:spacing w:after="40"/>
+            </w:pPr>
+            <w:r>
+              <w:rPr>
+                <w:rFonts w:ascii="Times New Roman" w:hAnsi="Times New Roman"/>
+              </w:rPr>
+              <w:t>CS.3.3.15. Examinar y practicar las normas de tránsito, deberes y derechos de peatones, ciclistas y usuarios de transporte para promover una movilidad segura, preventiva y sostenible.</w:t>
+            </w:r>
+          </w:p>
+          <w:p>
+            <w:pPr>
               <w:spacing w:after="60"/>
             </w:pPr>
-            <w:r/>
-            <w:r>
-              <w:rPr>
-                <w:rFonts w:ascii="Times New Roman" w:hAnsi="Times New Roman"/>
-              </w:rPr>
-              <w:t>LL.3.4.1. Relatar textos con secuencia lógica, manejo de conectores y coherencia en el uso de la persona y tiempo verbal, e integrarlos en diversas situaciones comunicativas.</w:t>
-            </w:r>
-          </w:p>
-          <w:p>
-            <w:pPr>
-              <w:spacing w:after="60"/>
-            </w:pPr>
-            <w:r>
-              <w:rPr>
-                <w:rFonts w:ascii="Times New Roman" w:hAnsi="Times New Roman"/>
-              </w:rPr>
-              <w:t>LL.3.4.6. Autorregular la producción escrita mediante el uso habitual del procedimiento de planificación, redacción y revisión del texto.</w:t>
-            </w:r>
-          </w:p>
-          <w:p>
-            <w:pPr>
-              <w:spacing w:after="60"/>
-            </w:pPr>
-            <w:r>
-              <w:rPr>
-                <w:rFonts w:ascii="Times New Roman" w:hAnsi="Times New Roman"/>
-              </w:rPr>
-              <w:t>LL.3.4.10. Expresar sus ideas con precisión e integrar en las producciones escritas los diferentes tipos de sustantivo, pronombre, adjetivo, verbo, adverbio y sus modificadores.</w:t>
-            </w:r>
-          </w:p>
-          <w:p>
-            <w:pPr>
-              <w:spacing w:after="40"/>
-            </w:pPr>
-            <w:r>
-              <w:rPr>
-                <w:rFonts w:ascii="Times New Roman" w:hAnsi="Times New Roman"/>
-              </w:rPr>
-              <w:t>CS.3.3.15. Examinar y practicar las normas de tránsito, deberes y derechos de peatones, ciclistas y usuarios de transporte para promover una movilidad segura, preventiva y sostenible.</w:t>
+            <w:r>
+              <w:drawing>
+                <wp:inline xmlns:a="http://schemas.openxmlformats.org/drawingml/2006/main" xmlns:pic="http://schemas.openxmlformats.org/drawingml/2006/picture">
+                  <wp:extent cx="329184" cy="323698"/>
+                  <wp:docPr id="85" name="Picture 85"/>
+                  <wp:cNvGraphicFramePr>
+                    <a:graphicFrameLocks noChangeAspect="1"/>
+                  </wp:cNvGraphicFramePr>
+                  <a:graphic>
+                    <a:graphicData uri="http://schemas.openxmlformats.org/drawingml/2006/picture">
+                      <pic:pic>
+                        <pic:nvPicPr>
+                          <pic:cNvPr id="0" name="image.png"/>
+                          <pic:cNvPicPr/>
+                        </pic:nvPicPr>
+                        <pic:blipFill>
+                          <a:blip r:embed="rId19"/>
+                          <a:stretch>
+                            <a:fillRect/>
+                          </a:stretch>
+                        </pic:blipFill>
+                        <pic:spPr>
+                          <a:xfrm>
+                            <a:off x="0" y="0"/>
+                            <a:ext cx="329184" cy="323698"/>
+                          </a:xfrm>
+                          <a:prstGeom prst="rect"/>
+                        </pic:spPr>
+                      </pic:pic>
+                    </a:graphicData>
+                  </a:graphic>
+                </wp:inline>
+              </w:drawing>
             </w:r>
           </w:p>
         </w:tc>
@@ -7149,36 +7595,166 @@
           </w:tcPr>
           <w:p>
             <w:pPr>
+              <w:spacing w:after="40"/>
+            </w:pPr>
+            <w:r/>
+            <w:r>
+              <w:rPr>
+                <w:rFonts w:ascii="Times New Roman" w:hAnsi="Times New Roman"/>
+              </w:rPr>
+              <w:t>LL.3.5.1. Reconocer en un texto literario los elementos característicos que le dan sentido.</w:t>
+            </w:r>
+          </w:p>
+          <w:p>
+            <w:pPr>
+              <w:spacing w:after="40"/>
+            </w:pPr>
+            <w:r>
+              <w:rPr>
+                <w:rFonts w:ascii="Times New Roman" w:hAnsi="Times New Roman"/>
+              </w:rPr>
+              <w:t>LL.3.5.2. Participar en discusiones sobre textos literarios con el aporte de información, experiencias y opiniones para desarrollar progresivamente la lectura crítica.</w:t>
+            </w:r>
+          </w:p>
+          <w:p>
+            <w:pPr>
+              <w:spacing w:after="80" w:before="40"/>
+            </w:pPr>
+            <w:r>
+              <w:drawing>
+                <wp:inline xmlns:a="http://schemas.openxmlformats.org/drawingml/2006/main" xmlns:pic="http://schemas.openxmlformats.org/drawingml/2006/picture">
+                  <wp:extent cx="347472" cy="163342"/>
+                  <wp:docPr id="86" name="Picture 86"/>
+                  <wp:cNvGraphicFramePr>
+                    <a:graphicFrameLocks noChangeAspect="1"/>
+                  </wp:cNvGraphicFramePr>
+                  <a:graphic>
+                    <a:graphicData uri="http://schemas.openxmlformats.org/drawingml/2006/picture">
+                      <pic:pic>
+                        <pic:nvPicPr>
+                          <pic:cNvPr id="0" name="image.png"/>
+                          <pic:cNvPicPr/>
+                        </pic:nvPicPr>
+                        <pic:blipFill>
+                          <a:blip r:embed="rId7"/>
+                          <a:stretch>
+                            <a:fillRect/>
+                          </a:stretch>
+                        </pic:blipFill>
+                        <pic:spPr>
+                          <a:xfrm>
+                            <a:off x="0" y="0"/>
+                            <a:ext cx="347472" cy="163342"/>
+                          </a:xfrm>
+                          <a:prstGeom prst="rect"/>
+                        </pic:spPr>
+                      </pic:pic>
+                    </a:graphicData>
+                  </a:graphic>
+                </wp:inline>
+              </w:drawing>
+            </w:r>
+            <w:r>
+              <w:t xml:space="preserve">  </w:t>
+            </w:r>
+            <w:r>
+              <w:drawing>
+                <wp:inline xmlns:a="http://schemas.openxmlformats.org/drawingml/2006/main" xmlns:pic="http://schemas.openxmlformats.org/drawingml/2006/picture">
+                  <wp:extent cx="347472" cy="190070"/>
+                  <wp:docPr id="87" name="Picture 87"/>
+                  <wp:cNvGraphicFramePr>
+                    <a:graphicFrameLocks noChangeAspect="1"/>
+                  </wp:cNvGraphicFramePr>
+                  <a:graphic>
+                    <a:graphicData uri="http://schemas.openxmlformats.org/drawingml/2006/picture">
+                      <pic:pic>
+                        <pic:nvPicPr>
+                          <pic:cNvPr id="0" name="image.png"/>
+                          <pic:cNvPicPr/>
+                        </pic:nvPicPr>
+                        <pic:blipFill>
+                          <a:blip r:embed="rId13"/>
+                          <a:stretch>
+                            <a:fillRect/>
+                          </a:stretch>
+                        </pic:blipFill>
+                        <pic:spPr>
+                          <a:xfrm>
+                            <a:off x="0" y="0"/>
+                            <a:ext cx="347472" cy="190070"/>
+                          </a:xfrm>
+                          <a:prstGeom prst="rect"/>
+                        </pic:spPr>
+                      </pic:pic>
+                    </a:graphicData>
+                  </a:graphic>
+                </wp:inline>
+              </w:drawing>
+            </w:r>
+            <w:r>
+              <w:t xml:space="preserve">  </w:t>
+            </w:r>
+          </w:p>
+          <w:p>
+            <w:pPr>
+              <w:spacing w:after="20"/>
+            </w:pPr>
+            <w:r>
+              <w:rPr>
+                <w:rFonts w:ascii="Times New Roman" w:hAnsi="Times New Roman"/>
+                <w:b/>
+              </w:rPr>
+              <w:t>✦ INSERCIÓN CURRICULAR: EDUCACIÓN SOCIOEMOCIONAL</w:t>
+            </w:r>
+          </w:p>
+          <w:p>
+            <w:pPr>
+              <w:spacing w:after="40"/>
+            </w:pPr>
+            <w:r>
+              <w:rPr>
+                <w:rFonts w:ascii="Times New Roman" w:hAnsi="Times New Roman"/>
+              </w:rPr>
+              <w:t>CS.3.3.8. Reconocer y valorar la diversidad de identidades, la autoestima y la expresión asertiva de emociones en situaciones de interacción social y cultural.</w:t>
+            </w:r>
+          </w:p>
+          <w:p>
+            <w:pPr>
               <w:spacing w:after="60"/>
             </w:pPr>
-            <w:r/>
-            <w:r>
-              <w:rPr>
-                <w:rFonts w:ascii="Times New Roman" w:hAnsi="Times New Roman"/>
-              </w:rPr>
-              <w:t>LL.3.5.1. Reconocer en un texto literario los elementos característicos que le dan sentido.</w:t>
-            </w:r>
-          </w:p>
-          <w:p>
-            <w:pPr>
-              <w:spacing w:after="60"/>
-            </w:pPr>
-            <w:r>
-              <w:rPr>
-                <w:rFonts w:ascii="Times New Roman" w:hAnsi="Times New Roman"/>
-              </w:rPr>
-              <w:t>LL.3.5.2. Participar en discusiones sobre textos literarios con el aporte de información, experiencias y opiniones para desarrollar progresivamente la lectura crítica.</w:t>
-            </w:r>
-          </w:p>
-          <w:p>
-            <w:pPr>
-              <w:spacing w:after="40"/>
-            </w:pPr>
-            <w:r>
-              <w:rPr>
-                <w:rFonts w:ascii="Times New Roman" w:hAnsi="Times New Roman"/>
-              </w:rPr>
-              <w:t>CS.3.3.8. Reconocer y valorar la diversidad de identidades, la autoestima y la expresión asertiva de emociones en situaciones de interacción social y cultural.</w:t>
+            <w:r>
+              <w:drawing>
+                <wp:inline xmlns:a="http://schemas.openxmlformats.org/drawingml/2006/main" xmlns:pic="http://schemas.openxmlformats.org/drawingml/2006/picture">
+                  <wp:extent cx="329184" cy="318897"/>
+                  <wp:docPr id="88" name="Picture 88"/>
+                  <wp:cNvGraphicFramePr>
+                    <a:graphicFrameLocks noChangeAspect="1"/>
+                  </wp:cNvGraphicFramePr>
+                  <a:graphic>
+                    <a:graphicData uri="http://schemas.openxmlformats.org/drawingml/2006/picture">
+                      <pic:pic>
+                        <pic:nvPicPr>
+                          <pic:cNvPr id="0" name="image.png"/>
+                          <pic:cNvPicPr/>
+                        </pic:nvPicPr>
+                        <pic:blipFill>
+                          <a:blip r:embed="rId18"/>
+                          <a:stretch>
+                            <a:fillRect/>
+                          </a:stretch>
+                        </pic:blipFill>
+                        <pic:spPr>
+                          <a:xfrm>
+                            <a:off x="0" y="0"/>
+                            <a:ext cx="329184" cy="318897"/>
+                          </a:xfrm>
+                          <a:prstGeom prst="rect"/>
+                        </pic:spPr>
+                      </pic:pic>
+                    </a:graphicData>
+                  </a:graphic>
+                </wp:inline>
+              </w:drawing>
             </w:r>
           </w:p>
         </w:tc>
@@ -8481,36 +9057,166 @@
           </w:tcPr>
           <w:p>
             <w:pPr>
+              <w:spacing w:after="40"/>
+            </w:pPr>
+            <w:r/>
+            <w:r>
+              <w:rPr>
+                <w:rFonts w:ascii="Times New Roman" w:hAnsi="Times New Roman"/>
+              </w:rPr>
+              <w:t>LL.3.5.6. Recrear textos literarios leídos o escuchados mediante el uso de diversos medios y recursos (incluidas las TIC).</w:t>
+            </w:r>
+          </w:p>
+          <w:p>
+            <w:pPr>
+              <w:spacing w:after="40"/>
+            </w:pPr>
+            <w:r>
+              <w:rPr>
+                <w:rFonts w:ascii="Times New Roman" w:hAnsi="Times New Roman"/>
+              </w:rPr>
+              <w:t>LL.3.4.13. Producir escritos de acuerdo con la situación comunicativa, mediante el empleo de diversos formatos, recursos y materiales.</w:t>
+            </w:r>
+          </w:p>
+          <w:p>
+            <w:pPr>
+              <w:spacing w:after="80" w:before="40"/>
+            </w:pPr>
+            <w:r>
+              <w:drawing>
+                <wp:inline xmlns:a="http://schemas.openxmlformats.org/drawingml/2006/main" xmlns:pic="http://schemas.openxmlformats.org/drawingml/2006/picture">
+                  <wp:extent cx="347472" cy="163342"/>
+                  <wp:docPr id="89" name="Picture 89"/>
+                  <wp:cNvGraphicFramePr>
+                    <a:graphicFrameLocks noChangeAspect="1"/>
+                  </wp:cNvGraphicFramePr>
+                  <a:graphic>
+                    <a:graphicData uri="http://schemas.openxmlformats.org/drawingml/2006/picture">
+                      <pic:pic>
+                        <pic:nvPicPr>
+                          <pic:cNvPr id="0" name="image.png"/>
+                          <pic:cNvPicPr/>
+                        </pic:nvPicPr>
+                        <pic:blipFill>
+                          <a:blip r:embed="rId7"/>
+                          <a:stretch>
+                            <a:fillRect/>
+                          </a:stretch>
+                        </pic:blipFill>
+                        <pic:spPr>
+                          <a:xfrm>
+                            <a:off x="0" y="0"/>
+                            <a:ext cx="347472" cy="163342"/>
+                          </a:xfrm>
+                          <a:prstGeom prst="rect"/>
+                        </pic:spPr>
+                      </pic:pic>
+                    </a:graphicData>
+                  </a:graphic>
+                </wp:inline>
+              </w:drawing>
+            </w:r>
+            <w:r>
+              <w:t xml:space="preserve">  </w:t>
+            </w:r>
+            <w:r>
+              <w:drawing>
+                <wp:inline xmlns:a="http://schemas.openxmlformats.org/drawingml/2006/main" xmlns:pic="http://schemas.openxmlformats.org/drawingml/2006/picture">
+                  <wp:extent cx="347472" cy="255612"/>
+                  <wp:docPr id="90" name="Picture 90"/>
+                  <wp:cNvGraphicFramePr>
+                    <a:graphicFrameLocks noChangeAspect="1"/>
+                  </wp:cNvGraphicFramePr>
+                  <a:graphic>
+                    <a:graphicData uri="http://schemas.openxmlformats.org/drawingml/2006/picture">
+                      <pic:pic>
+                        <pic:nvPicPr>
+                          <pic:cNvPr id="0" name="image.png"/>
+                          <pic:cNvPicPr/>
+                        </pic:nvPicPr>
+                        <pic:blipFill>
+                          <a:blip r:embed="rId11"/>
+                          <a:stretch>
+                            <a:fillRect/>
+                          </a:stretch>
+                        </pic:blipFill>
+                        <pic:spPr>
+                          <a:xfrm>
+                            <a:off x="0" y="0"/>
+                            <a:ext cx="347472" cy="255612"/>
+                          </a:xfrm>
+                          <a:prstGeom prst="rect"/>
+                        </pic:spPr>
+                      </pic:pic>
+                    </a:graphicData>
+                  </a:graphic>
+                </wp:inline>
+              </w:drawing>
+            </w:r>
+            <w:r>
+              <w:t xml:space="preserve">  </w:t>
+            </w:r>
+          </w:p>
+          <w:p>
+            <w:pPr>
+              <w:spacing w:after="20"/>
+            </w:pPr>
+            <w:r>
+              <w:rPr>
+                <w:rFonts w:ascii="Times New Roman" w:hAnsi="Times New Roman"/>
+                <w:b/>
+              </w:rPr>
+              <w:t>✦ INSERCIÓN CURRICULAR: EDUCACIÓN PARA LA SEGURIDAD VIAL Y MOVILIDAD SOSTENIBLE</w:t>
+            </w:r>
+          </w:p>
+          <w:p>
+            <w:pPr>
+              <w:spacing w:after="40"/>
+            </w:pPr>
+            <w:r>
+              <w:rPr>
+                <w:rFonts w:ascii="Times New Roman" w:hAnsi="Times New Roman"/>
+              </w:rPr>
+              <w:t>CS.3.3.16. Identificar las señales de tránsito, las zonas de seguridad escolar y las medidas de prevención de accidentes viales en los desplazamientos cotidianos.</w:t>
+            </w:r>
+          </w:p>
+          <w:p>
+            <w:pPr>
               <w:spacing w:after="60"/>
             </w:pPr>
-            <w:r/>
-            <w:r>
-              <w:rPr>
-                <w:rFonts w:ascii="Times New Roman" w:hAnsi="Times New Roman"/>
-              </w:rPr>
-              <w:t>LL.3.5.6. Recrear textos literarios leídos o escuchados mediante el uso de diversos medios y recursos (incluidas las TIC).</w:t>
-            </w:r>
-          </w:p>
-          <w:p>
-            <w:pPr>
-              <w:spacing w:after="60"/>
-            </w:pPr>
-            <w:r>
-              <w:rPr>
-                <w:rFonts w:ascii="Times New Roman" w:hAnsi="Times New Roman"/>
-              </w:rPr>
-              <w:t>LL.3.4.13. Producir escritos de acuerdo con la situación comunicativa, mediante el empleo de diversos formatos, recursos y materiales.</w:t>
-            </w:r>
-          </w:p>
-          <w:p>
-            <w:pPr>
-              <w:spacing w:after="40"/>
-            </w:pPr>
-            <w:r>
-              <w:rPr>
-                <w:rFonts w:ascii="Times New Roman" w:hAnsi="Times New Roman"/>
-              </w:rPr>
-              <w:t>CS.3.3.16. Identificar las señales de tránsito, las zonas de seguridad escolar y las medidas de prevención de accidentes viales en los desplazamientos cotidianos.</w:t>
+            <w:r>
+              <w:drawing>
+                <wp:inline xmlns:a="http://schemas.openxmlformats.org/drawingml/2006/main" xmlns:pic="http://schemas.openxmlformats.org/drawingml/2006/picture">
+                  <wp:extent cx="329184" cy="323698"/>
+                  <wp:docPr id="91" name="Picture 91"/>
+                  <wp:cNvGraphicFramePr>
+                    <a:graphicFrameLocks noChangeAspect="1"/>
+                  </wp:cNvGraphicFramePr>
+                  <a:graphic>
+                    <a:graphicData uri="http://schemas.openxmlformats.org/drawingml/2006/picture">
+                      <pic:pic>
+                        <pic:nvPicPr>
+                          <pic:cNvPr id="0" name="image.png"/>
+                          <pic:cNvPicPr/>
+                        </pic:nvPicPr>
+                        <pic:blipFill>
+                          <a:blip r:embed="rId19"/>
+                          <a:stretch>
+                            <a:fillRect/>
+                          </a:stretch>
+                        </pic:blipFill>
+                        <pic:spPr>
+                          <a:xfrm>
+                            <a:off x="0" y="0"/>
+                            <a:ext cx="329184" cy="323698"/>
+                          </a:xfrm>
+                          <a:prstGeom prst="rect"/>
+                        </pic:spPr>
+                      </pic:pic>
+                    </a:graphicData>
+                  </a:graphic>
+                </wp:inline>
+              </w:drawing>
             </w:r>
           </w:p>
         </w:tc>

</xml_diff>

<commit_message>
fix: corregir guardado de tema y destreza de semana y migrar notas
</commit_message>
<xml_diff>
--- a/PLANIFICACION_MICROCURRICULAR_7MO_LENGUA_1ER_TRIMESTRE final.docx
+++ b/PLANIFICACION_MICROCURRICULAR_7MO_LENGUA_1ER_TRIMESTRE final.docx
@@ -1705,6 +1705,18 @@
                   </a:graphic>
                 </wp:inline>
               </w:drawing>
+            </w:r>
+          </w:p>
+          <w:p>
+            <w:pPr>
+              <w:spacing w:before="60"/>
+            </w:pPr>
+            <w:r>
+              <w:rPr>
+                <w:rFonts w:ascii="Times New Roman" w:hAnsi="Times New Roman"/>
+                <w:sz w:val="20"/>
+              </w:rPr>
+              <w:t>LL.3.1.3. Indagar sobre las características de los pueblos y nacionalidades del Ecuador que tienen otras lenguas (kichwa, shuar, achuar, waorani, entre otras), valorando la diversidad lingüística como riqueza cultural del país.</w:t>
             </w:r>
           </w:p>
         </w:tc>

</xml_diff>